<commit_message>
Expand chapter 10 with the global origins and flagship lessors.
Add the US 1950s takeoff, Japan and European diffusion, the aircraft-leasing lineage, and representative platforms so the China review sits on an international map.

Co-authored-by: kid2226 <kid2226@users.noreply.github.com>
</commit_message>
<xml_diff>
--- a/reports/中国金融租赁行业综述.docx
+++ b/reports/中国金融租赁行业综述.docx
@@ -392,7 +392,7 @@
           <w:i w:val="0"/>
           <w:sz w:val="22"/>
         </w:rPr>
-        <w:t>金租与商租、国际比较</w:t>
+        <w:t>国际源流、双轨制与比较</w:t>
       </w:r>
     </w:p>
     <w:p>
@@ -407,7 +407,7 @@
           <w:i w:val="0"/>
           <w:sz w:val="22"/>
         </w:rPr>
-        <w:t>双轨制的制度含义；与欧美经营性租赁、日本租赁、飞机船舶跨境租赁的对照。</w:t>
+        <w:t>现代租赁的起源与全球演进；代表性机构；中国金租/商租双轨制；国际经验哪些可借鉴、哪些不可照搬。</w:t>
       </w:r>
     </w:p>
     <w:p>
@@ -467,7 +467,7 @@
           <w:i w:val="0"/>
           <w:sz w:val="22"/>
         </w:rPr>
-        <w:t>监管指标速查、关键政策年表、资料来源。</w:t>
+        <w:t>中国政策年表、2025年核心数据、国际租赁简年表、概念对照、资料来源。</w:t>
       </w:r>
     </w:p>
     <w:p>
@@ -766,7 +766,7 @@
           <w:i w:val="0"/>
           <w:sz w:val="22"/>
         </w:rPr>
-        <w:t xml:space="preserve"> 真正决定下一阶段胜负的，不是谁还能把规模做大，而是谁能在租赁物估值、残值管理、二级市场流转和产业认知上建立起可复制的专业能力。</w:t>
+        <w:t xml:space="preserve"> 这与国际租赁从1950年代美国独立第三方起步、经日本综合租赁和爱尔兰航空平台做成熟的路径一致：真正决定下一阶段胜负的，不是谁还能把规模做大，而是谁能在租赁物估值、残值管理、二级市场流转和产业认知上建立起可复制的专业能力。</w:t>
       </w:r>
     </w:p>
     <w:p>
@@ -2545,6 +2545,21 @@
       </w:pPr>
       <w:r>
         <w:t>三、历史演进：从引进设备到银行系主导</w:t>
+      </w:r>
+    </w:p>
+    <w:p>
+      <w:pPr>
+        <w:spacing w:before="0" w:after="160" w:line="307" w:lineRule="auto"/>
+        <w:ind w:firstLine="420"/>
+      </w:pPr>
+      <w:r>
+        <w:rPr>
+          <w:rFonts w:ascii="Calibri" w:hAnsi="Calibri" w:eastAsia="WenQuanYi Micro Hei"/>
+          <w:b w:val="0"/>
+          <w:i w:val="0"/>
+          <w:sz w:val="22"/>
+        </w:rPr>
+        <w:t>中国并没有“发明”金融租赁。1980年前后引进的，是美国1950年代已经成型、又经日本和欧洲扩散的一套交易技术：把设备的使用权与所有权拆开，用租金匹配资产的使用寿命。国际源流、代表机构和今日全球头部格局，见第十章；本章只写这套技术进入中国之后，怎样长成银行子公司主导的持牌金租行业。</w:t>
       </w:r>
     </w:p>
     <w:p>
@@ -8176,19 +8191,34 @@
         <w:pStyle w:val="Heading2"/>
       </w:pPr>
       <w:r>
-        <w:t>十、金租与商租、国际比较</w:t>
+        <w:t>十、国际源流、双轨制与比较</w:t>
       </w:r>
     </w:p>
     <w:p>
       <w:pPr>
-        <w:pStyle w:val="Heading3"/>
-      </w:pPr>
-      <w:r>
-        <w:t>10.1 双轨制为什么还在</w:t>
+        <w:spacing w:before="0" w:after="160" w:line="307" w:lineRule="auto"/>
+        <w:ind w:firstLine="420"/>
+      </w:pPr>
+      <w:r>
+        <w:rPr>
+          <w:rFonts w:ascii="Calibri" w:hAnsi="Calibri" w:eastAsia="WenQuanYi Micro Hei"/>
+          <w:b w:val="0"/>
+          <w:i w:val="0"/>
+          <w:sz w:val="22"/>
+        </w:rPr>
+        <w:t>国际上几乎没有与中国“金融租赁公司”一一对应的牌照名称。主流市场里，做同一类生意的机构分别叫独立租赁商、银行系租赁子公司、厂商财务公司（captive finance）和航空/航运专业出租人。要理解中国金租为什么必须“回归融物”，先要看这门生意在海外是怎么长出来的、后来又长成了谁。</w:t>
       </w:r>
     </w:p>
     <w:p>
       <w:pPr>
+        <w:pStyle w:val="Heading3"/>
+      </w:pPr>
+      <w:r>
+        <w:t>10.1 起源：从租用到独立第三方租赁</w:t>
+      </w:r>
+    </w:p>
+    <w:p>
+      <w:pPr>
         <w:spacing w:before="0" w:after="160" w:line="307" w:lineRule="auto"/>
         <w:ind w:firstLine="420"/>
       </w:pPr>
@@ -8199,7 +8229,7 @@
           <w:i w:val="0"/>
           <w:sz w:val="22"/>
         </w:rPr>
-        <w:t>中国租赁市场长期并行两套牌照。金租少而强，商租多而弱。2018年机构改革后，商租从商务部划转至地方金融管理部门，监管趋势与金租趋同：强调租赁物、限制通道、支持设备更新。中诚信等机构预计，商租监管将继续向金租靠拢，但短期内不会获得同业拆借和金融债的同等待遇。</w:t>
+        <w:t>租赁作为“用而不必一次买断”的安排，远早于现代金融。两河流域的泥板契约和《汉谟拉比法典》里已有农具、土地和船只的租用条款；中世纪欧洲的商船租约、中国传统社会的耕牛和房屋出典，都属于同一谱系。这些交易解决的是占有与使用，还不是系统化的中长期设备融资。</w:t>
       </w:r>
     </w:p>
     <w:p>
@@ -8214,15 +8244,1852 @@
           <w:i w:val="0"/>
           <w:sz w:val="22"/>
         </w:rPr>
-        <w:t>功能分工可以是健康的：金租做大额、跨境、重资产和资本密集型项目；商租做区域、厂商、中小设备。风险在于：商租在地方债务和通道业务出清后，同样面临转型，部分主体可能把风险资产转向金租无法做的灰色地带，或反过来成为金租的“出表通道”——这正是联合租赁、资产转让规则要堵住的口子。2024年办法要求租赁资产转让必须真实、完整、洁净，不得回购、差额补足或抽屉协议。</w:t>
+        <w:t>更接近现代形态的一步，发生在19世纪的美国铁路业。机车、车厢造价高、经济寿命长，铁路公司用设备信托凭证（equipment trust certificate）把车辆的所有权放在受托人名下，用租金和运输收入偿付投资人。物权与债权被第一次稳定地绑在同一件可移动的生产设备上。</w:t>
       </w:r>
     </w:p>
     <w:p>
       <w:pPr>
+        <w:spacing w:before="0" w:after="160" w:line="307" w:lineRule="auto"/>
+        <w:ind w:firstLine="420"/>
+      </w:pPr>
+      <w:r>
+        <w:rPr>
+          <w:rFonts w:ascii="Calibri" w:hAnsi="Calibri" w:eastAsia="WenQuanYi Micro Hei"/>
+          <w:b w:val="0"/>
+          <w:i w:val="0"/>
+          <w:sz w:val="22"/>
+        </w:rPr>
+        <w:t>真正的行业起点，是二战后美国把这种想法做成一家专门公司。1952—1954年，亨利·舍恩菲尔德（Henry B. Schoenfeld）在旧金山创办美国租赁公司（United States Leasing Corporation）。设备租赁与融资协会（ELFA）将其视为第一家以通用设备租赁为主业的独立机构：出租人按承租人指定购买设备，承租人支付租金并承担维修、保险和税负，租期覆盖资产的大部分经济寿命。随后出现Boothe Leasing、Chandler Leasing，以及通用电气信用公司（GECC）、商业信用公司（Commercial Credit）等金融系和厂商系参与者。厂商租赁几乎同时兴起——IBM、施乐发现，把大型主机和复印机租出去，比一次性卖断更能锁定客户、平滑自身的销售周期。</w:t>
+      </w:r>
+    </w:p>
+    <w:p>
+      <w:pPr>
+        <w:spacing w:before="0" w:after="160" w:line="307" w:lineRule="auto"/>
+        <w:ind w:firstLine="420"/>
+      </w:pPr>
+      <w:r>
+        <w:rPr>
+          <w:rFonts w:ascii="Calibri" w:hAnsi="Calibri" w:eastAsia="WenQuanYi Micro Hei"/>
+          <w:b w:val="0"/>
+          <w:i w:val="0"/>
+          <w:sz w:val="22"/>
+        </w:rPr>
+        <w:t>这一阶段留下三条至今仍在起作用的基因：</w:t>
+      </w:r>
+    </w:p>
+    <w:p>
+      <w:pPr>
+        <w:pStyle w:val="ListNumber"/>
+        <w:spacing w:before="20" w:after="60" w:line="288" w:lineRule="auto"/>
+      </w:pPr>
+      <w:r>
+        <w:rPr>
+          <w:rFonts w:ascii="Calibri" w:hAnsi="Calibri" w:eastAsia="WenQuanYi Micro Hei"/>
+          <w:b/>
+          <w:i w:val="0"/>
+          <w:sz w:val="22"/>
+        </w:rPr>
+        <w:t>所有权服务于使用权。</w:t>
+      </w:r>
+      <w:r>
+        <w:rPr>
+          <w:rFonts w:ascii="Calibri" w:hAnsi="Calibri" w:eastAsia="WenQuanYi Micro Hei"/>
+          <w:b w:val="0"/>
+          <w:i w:val="0"/>
+          <w:sz w:val="22"/>
+        </w:rPr>
+        <w:t xml:space="preserve"> 企业要的是产能，不是资产负债表上的固定资产。</w:t>
+      </w:r>
+    </w:p>
+    <w:p>
+      <w:pPr>
+        <w:pStyle w:val="ListNumber"/>
+        <w:spacing w:before="20" w:after="60" w:line="288" w:lineRule="auto"/>
+      </w:pPr>
+      <w:r>
+        <w:rPr>
+          <w:rFonts w:ascii="Calibri" w:hAnsi="Calibri" w:eastAsia="WenQuanYi Micro Hei"/>
+          <w:b/>
+          <w:i w:val="0"/>
+          <w:sz w:val="22"/>
+        </w:rPr>
+        <w:t>独立第三方可以比厂商或银行更专业。</w:t>
+      </w:r>
+      <w:r>
+        <w:rPr>
+          <w:rFonts w:ascii="Calibri" w:hAnsi="Calibri" w:eastAsia="WenQuanYi Micro Hei"/>
+          <w:b w:val="0"/>
+          <w:i w:val="0"/>
+          <w:sz w:val="22"/>
+        </w:rPr>
+        <w:t xml:space="preserve"> 租赁公司的产品是交易结构、余值判断和再投放，而不只是资金。</w:t>
+      </w:r>
+    </w:p>
+    <w:p>
+      <w:pPr>
+        <w:pStyle w:val="ListNumber"/>
+        <w:spacing w:before="20" w:after="60" w:line="288" w:lineRule="auto"/>
+      </w:pPr>
+      <w:r>
+        <w:rPr>
+          <w:rFonts w:ascii="Calibri" w:hAnsi="Calibri" w:eastAsia="WenQuanYi Micro Hei"/>
+          <w:b/>
+          <w:i w:val="0"/>
+          <w:sz w:val="22"/>
+        </w:rPr>
+        <w:t>税、会计和监管会重塑行业，而不是相反。</w:t>
+      </w:r>
+      <w:r>
+        <w:rPr>
+          <w:rFonts w:ascii="Calibri" w:hAnsi="Calibri" w:eastAsia="WenQuanYi Micro Hei"/>
+          <w:b w:val="0"/>
+          <w:i w:val="0"/>
+          <w:sz w:val="22"/>
+        </w:rPr>
+        <w:t xml:space="preserve"> 美国后来的杠杆租赁、真实租赁（true lease）认定、1986年税制改革，以及FAS 13、IAS 17到IFRS 16的会计变迁，每一次都改写了谁来做租赁、做成什么样子。</w:t>
+      </w:r>
+    </w:p>
+    <w:p>
+      <w:pPr>
         <w:pStyle w:val="Heading3"/>
       </w:pPr>
       <w:r>
-        <w:t>10.2 国际坐标</w:t>
+        <w:t>10.2 全球扩散：日本、欧洲与航空租赁中心</w:t>
+      </w:r>
+    </w:p>
+    <w:p>
+      <w:pPr>
+        <w:spacing w:before="0" w:after="160" w:line="307" w:lineRule="auto"/>
+        <w:ind w:firstLine="420"/>
+      </w:pPr>
+      <w:r>
+        <w:rPr>
+          <w:rFonts w:ascii="Calibri" w:hAnsi="Calibri" w:eastAsia="WenQuanYi Micro Hei"/>
+          <w:b w:val="0"/>
+          <w:i w:val="0"/>
+          <w:sz w:val="22"/>
+        </w:rPr>
+        <w:t>1960年代，美国模式向东亚和欧洲输出。1964年，日绵（后为双日）与美国租赁公司在大阪合资成立东方租赁（Orient Leasing），三和银行提供后盾，这就是今天欧力士（ORIX）的前身。租赁进入日本的语境，是高速增长期制造业需要快速更新设备，而又不必把全部资本压在机台上。欧洲则由银行子公司和厂商财务公司两条线推进：德国、法国、英国先后形成以设备与汽车为主的租赁市场，1972年前后欧洲租赁协会（Leaseurope）把各国行业协会拢到同一张网上。</w:t>
+      </w:r>
+    </w:p>
+    <w:p>
+      <w:pPr>
+        <w:spacing w:before="0" w:after="160" w:line="307" w:lineRule="auto"/>
+        <w:ind w:firstLine="420"/>
+      </w:pPr>
+      <w:r>
+        <w:rPr>
+          <w:rFonts w:ascii="Calibri" w:hAnsi="Calibri" w:eastAsia="WenQuanYi Micro Hei"/>
+          <w:b w:val="0"/>
+          <w:i w:val="0"/>
+          <w:sz w:val="22"/>
+        </w:rPr>
+        <w:t>1970年代出现了第二个、也是至今最全球化的分支——飞机经营性租赁。1973年，史蒂文·乌德瓦尔-哈齐（Steven Udvar-Házy）等人在洛杉矶创立国际租赁金融公司（ILFC）；1975年，托尼·瑞安（Tony Ryan）在爱尔兰香农自贸区创立GPA（Guinness Peat Aviation）。航空公司由此可以把机队从“买断+贷款”改成“按航季和运力租用”，把残值、再营销和部分技术迭代风险交给出租人。爱尔兰随后凭税收协定、普通法传统和航空专业人才，成为全球飞机租赁的登记与管理中心。GPA在1990年代重组后，人员与资产流向GECAS、AerCap等后继者；ILFC先被AIG收购，2014年再被AerCap买下。2021年AerCap收购通用电气旗下GECAS，把两条历史源流收进同一家公司。</w:t>
+      </w:r>
+    </w:p>
+    <w:p>
+      <w:pPr>
+        <w:spacing w:before="0" w:after="160" w:line="307" w:lineRule="auto"/>
+        <w:ind w:firstLine="420"/>
+      </w:pPr>
+      <w:r>
+        <w:rPr>
+          <w:rFonts w:ascii="Calibri" w:hAnsi="Calibri" w:eastAsia="WenQuanYi Micro Hei"/>
+          <w:b w:val="0"/>
+          <w:i w:val="0"/>
+          <w:sz w:val="22"/>
+        </w:rPr>
+        <w:t>1980—2000年代，全球租赁形成比较稳定的三分结构：</w:t>
+      </w:r>
+    </w:p>
+    <w:tbl>
+      <w:tblPr>
+        <w:tblStyle w:val="TableGrid"/>
+        <w:tblW w:type="auto" w:w="0"/>
+        <w:jc w:val="center"/>
+        <w:tblLook w:firstColumn="1" w:firstRow="1" w:lastColumn="0" w:lastRow="0" w:noHBand="0" w:noVBand="1" w:val="04A0"/>
+      </w:tblPr>
+      <w:tblGrid>
+        <w:gridCol w:w="3173"/>
+        <w:gridCol w:w="3173"/>
+        <w:gridCol w:w="3173"/>
+      </w:tblGrid>
+      <w:tr>
+        <w:tc>
+          <w:tcPr>
+            <w:tcW w:type="dxa" w:w="3173"/>
+            <w:shd w:val="clear" w:fill="1F3A5F"/>
+          </w:tcPr>
+          <w:p>
+            <w:pPr>
+              <w:spacing w:before="40" w:after="40" w:line="276" w:lineRule="auto"/>
+            </w:pPr>
+            <w:r/>
+            <w:r>
+              <w:rPr>
+                <w:rFonts w:ascii="Calibri" w:hAnsi="Calibri" w:eastAsia="WenQuanYi Micro Hei"/>
+                <w:b/>
+                <w:i w:val="0"/>
+                <w:color w:val="FFFFFF"/>
+                <w:sz w:val="18"/>
+              </w:rPr>
+              <w:t>阶段</w:t>
+            </w:r>
+          </w:p>
+        </w:tc>
+        <w:tc>
+          <w:tcPr>
+            <w:tcW w:type="dxa" w:w="3173"/>
+            <w:shd w:val="clear" w:fill="1F3A5F"/>
+          </w:tcPr>
+          <w:p>
+            <w:pPr>
+              <w:spacing w:before="40" w:after="40" w:line="276" w:lineRule="auto"/>
+            </w:pPr>
+            <w:r/>
+            <w:r>
+              <w:rPr>
+                <w:rFonts w:ascii="Calibri" w:hAnsi="Calibri" w:eastAsia="WenQuanYi Micro Hei"/>
+                <w:b/>
+                <w:i w:val="0"/>
+                <w:color w:val="FFFFFF"/>
+                <w:sz w:val="18"/>
+              </w:rPr>
+              <w:t>时间</w:t>
+            </w:r>
+          </w:p>
+        </w:tc>
+        <w:tc>
+          <w:tcPr>
+            <w:tcW w:type="dxa" w:w="3173"/>
+            <w:shd w:val="clear" w:fill="1F3A5F"/>
+          </w:tcPr>
+          <w:p>
+            <w:pPr>
+              <w:spacing w:before="40" w:after="40" w:line="276" w:lineRule="auto"/>
+            </w:pPr>
+            <w:r/>
+            <w:r>
+              <w:rPr>
+                <w:rFonts w:ascii="Calibri" w:hAnsi="Calibri" w:eastAsia="WenQuanYi Micro Hei"/>
+                <w:b/>
+                <w:i w:val="0"/>
+                <w:color w:val="FFFFFF"/>
+                <w:sz w:val="18"/>
+              </w:rPr>
+              <w:t>特征</w:t>
+            </w:r>
+          </w:p>
+        </w:tc>
+      </w:tr>
+      <w:tr>
+        <w:tc>
+          <w:tcPr>
+            <w:tcW w:type="dxa" w:w="3173"/>
+            <w:shd w:val="clear" w:fill="FFFFFF"/>
+          </w:tcPr>
+          <w:p>
+            <w:pPr>
+              <w:spacing w:before="40" w:after="40" w:line="276" w:lineRule="auto"/>
+            </w:pPr>
+            <w:r/>
+            <w:r>
+              <w:rPr>
+                <w:rFonts w:ascii="Calibri" w:hAnsi="Calibri" w:eastAsia="WenQuanYi Micro Hei"/>
+                <w:b w:val="0"/>
+                <w:i w:val="0"/>
+                <w:sz w:val="18"/>
+              </w:rPr>
+              <w:t>美国创生</w:t>
+            </w:r>
+          </w:p>
+        </w:tc>
+        <w:tc>
+          <w:tcPr>
+            <w:tcW w:type="dxa" w:w="3173"/>
+            <w:shd w:val="clear" w:fill="FFFFFF"/>
+          </w:tcPr>
+          <w:p>
+            <w:pPr>
+              <w:spacing w:before="40" w:after="40" w:line="276" w:lineRule="auto"/>
+            </w:pPr>
+            <w:r/>
+            <w:r>
+              <w:rPr>
+                <w:rFonts w:ascii="Calibri" w:hAnsi="Calibri" w:eastAsia="WenQuanYi Micro Hei"/>
+                <w:b w:val="0"/>
+                <w:i w:val="0"/>
+                <w:sz w:val="18"/>
+              </w:rPr>
+              <w:t>1950—1960年代</w:t>
+            </w:r>
+          </w:p>
+        </w:tc>
+        <w:tc>
+          <w:tcPr>
+            <w:tcW w:type="dxa" w:w="3173"/>
+            <w:shd w:val="clear" w:fill="FFFFFF"/>
+          </w:tcPr>
+          <w:p>
+            <w:pPr>
+              <w:spacing w:before="40" w:after="40" w:line="276" w:lineRule="auto"/>
+            </w:pPr>
+            <w:r/>
+            <w:r>
+              <w:rPr>
+                <w:rFonts w:ascii="Calibri" w:hAnsi="Calibri" w:eastAsia="WenQuanYi Micro Hei"/>
+                <w:b w:val="0"/>
+                <w:i w:val="0"/>
+                <w:sz w:val="18"/>
+              </w:rPr>
+              <w:t>独立第三方设备租赁 + 厂商租赁；税和会计开始定义“什么算租赁”</w:t>
+            </w:r>
+          </w:p>
+        </w:tc>
+      </w:tr>
+      <w:tr>
+        <w:tc>
+          <w:tcPr>
+            <w:tcW w:type="dxa" w:w="3173"/>
+            <w:shd w:val="clear" w:fill="F4F7FB"/>
+          </w:tcPr>
+          <w:p>
+            <w:pPr>
+              <w:spacing w:before="40" w:after="40" w:line="276" w:lineRule="auto"/>
+            </w:pPr>
+            <w:r/>
+            <w:r>
+              <w:rPr>
+                <w:rFonts w:ascii="Calibri" w:hAnsi="Calibri" w:eastAsia="WenQuanYi Micro Hei"/>
+                <w:b w:val="0"/>
+                <w:i w:val="0"/>
+                <w:sz w:val="18"/>
+              </w:rPr>
+              <w:t>日欧产业化</w:t>
+            </w:r>
+          </w:p>
+        </w:tc>
+        <w:tc>
+          <w:tcPr>
+            <w:tcW w:type="dxa" w:w="3173"/>
+            <w:shd w:val="clear" w:fill="F4F7FB"/>
+          </w:tcPr>
+          <w:p>
+            <w:pPr>
+              <w:spacing w:before="40" w:after="40" w:line="276" w:lineRule="auto"/>
+            </w:pPr>
+            <w:r/>
+            <w:r>
+              <w:rPr>
+                <w:rFonts w:ascii="Calibri" w:hAnsi="Calibri" w:eastAsia="WenQuanYi Micro Hei"/>
+                <w:b w:val="0"/>
+                <w:i w:val="0"/>
+                <w:sz w:val="18"/>
+              </w:rPr>
+              <w:t>1960—1980年代</w:t>
+            </w:r>
+          </w:p>
+        </w:tc>
+        <w:tc>
+          <w:tcPr>
+            <w:tcW w:type="dxa" w:w="3173"/>
+            <w:shd w:val="clear" w:fill="F4F7FB"/>
+          </w:tcPr>
+          <w:p>
+            <w:pPr>
+              <w:spacing w:before="40" w:after="40" w:line="276" w:lineRule="auto"/>
+            </w:pPr>
+            <w:r/>
+            <w:r>
+              <w:rPr>
+                <w:rFonts w:ascii="Calibri" w:hAnsi="Calibri" w:eastAsia="WenQuanYi Micro Hei"/>
+                <w:b w:val="0"/>
+                <w:i w:val="0"/>
+                <w:sz w:val="18"/>
+              </w:rPr>
+              <w:t>银行系和综合商社进入；租赁成为制造业设备更新的常规工具</w:t>
+            </w:r>
+          </w:p>
+        </w:tc>
+      </w:tr>
+      <w:tr>
+        <w:tc>
+          <w:tcPr>
+            <w:tcW w:type="dxa" w:w="3173"/>
+            <w:shd w:val="clear" w:fill="FFFFFF"/>
+          </w:tcPr>
+          <w:p>
+            <w:pPr>
+              <w:spacing w:before="40" w:after="40" w:line="276" w:lineRule="auto"/>
+            </w:pPr>
+            <w:r/>
+            <w:r>
+              <w:rPr>
+                <w:rFonts w:ascii="Calibri" w:hAnsi="Calibri" w:eastAsia="WenQuanYi Micro Hei"/>
+                <w:b w:val="0"/>
+                <w:i w:val="0"/>
+                <w:sz w:val="18"/>
+              </w:rPr>
+              <w:t>航空/航运专业化</w:t>
+            </w:r>
+          </w:p>
+        </w:tc>
+        <w:tc>
+          <w:tcPr>
+            <w:tcW w:type="dxa" w:w="3173"/>
+            <w:shd w:val="clear" w:fill="FFFFFF"/>
+          </w:tcPr>
+          <w:p>
+            <w:pPr>
+              <w:spacing w:before="40" w:after="40" w:line="276" w:lineRule="auto"/>
+            </w:pPr>
+            <w:r/>
+            <w:r>
+              <w:rPr>
+                <w:rFonts w:ascii="Calibri" w:hAnsi="Calibri" w:eastAsia="WenQuanYi Micro Hei"/>
+                <w:b w:val="0"/>
+                <w:i w:val="0"/>
+                <w:sz w:val="18"/>
+              </w:rPr>
+              <w:t>1970年代至今</w:t>
+            </w:r>
+          </w:p>
+        </w:tc>
+        <w:tc>
+          <w:tcPr>
+            <w:tcW w:type="dxa" w:w="3173"/>
+            <w:shd w:val="clear" w:fill="FFFFFF"/>
+          </w:tcPr>
+          <w:p>
+            <w:pPr>
+              <w:spacing w:before="40" w:after="40" w:line="276" w:lineRule="auto"/>
+            </w:pPr>
+            <w:r/>
+            <w:r>
+              <w:rPr>
+                <w:rFonts w:ascii="Calibri" w:hAnsi="Calibri" w:eastAsia="WenQuanYi Micro Hei"/>
+                <w:b w:val="0"/>
+                <w:i w:val="0"/>
+                <w:sz w:val="18"/>
+              </w:rPr>
+              <w:t>经营性租赁、SPV、跨境登记和残值市场成为独立产业</w:t>
+            </w:r>
+          </w:p>
+        </w:tc>
+      </w:tr>
+      <w:tr>
+        <w:tc>
+          <w:tcPr>
+            <w:tcW w:type="dxa" w:w="3173"/>
+            <w:shd w:val="clear" w:fill="F4F7FB"/>
+          </w:tcPr>
+          <w:p>
+            <w:pPr>
+              <w:spacing w:before="40" w:after="40" w:line="276" w:lineRule="auto"/>
+            </w:pPr>
+            <w:r/>
+            <w:r>
+              <w:rPr>
+                <w:rFonts w:ascii="Calibri" w:hAnsi="Calibri" w:eastAsia="WenQuanYi Micro Hei"/>
+                <w:b w:val="0"/>
+                <w:i w:val="0"/>
+                <w:sz w:val="18"/>
+              </w:rPr>
+              <w:t>规模化与并表</w:t>
+            </w:r>
+          </w:p>
+        </w:tc>
+        <w:tc>
+          <w:tcPr>
+            <w:tcW w:type="dxa" w:w="3173"/>
+            <w:shd w:val="clear" w:fill="F4F7FB"/>
+          </w:tcPr>
+          <w:p>
+            <w:pPr>
+              <w:spacing w:before="40" w:after="40" w:line="276" w:lineRule="auto"/>
+            </w:pPr>
+            <w:r/>
+            <w:r>
+              <w:rPr>
+                <w:rFonts w:ascii="Calibri" w:hAnsi="Calibri" w:eastAsia="WenQuanYi Micro Hei"/>
+                <w:b w:val="0"/>
+                <w:i w:val="0"/>
+                <w:sz w:val="18"/>
+              </w:rPr>
+              <w:t>1990—2010年代</w:t>
+            </w:r>
+          </w:p>
+        </w:tc>
+        <w:tc>
+          <w:tcPr>
+            <w:tcW w:type="dxa" w:w="3173"/>
+            <w:shd w:val="clear" w:fill="F4F7FB"/>
+          </w:tcPr>
+          <w:p>
+            <w:pPr>
+              <w:spacing w:before="40" w:after="40" w:line="276" w:lineRule="auto"/>
+            </w:pPr>
+            <w:r/>
+            <w:r>
+              <w:rPr>
+                <w:rFonts w:ascii="Calibri" w:hAnsi="Calibri" w:eastAsia="WenQuanYi Micro Hei"/>
+                <w:b w:val="0"/>
+                <w:i w:val="0"/>
+                <w:sz w:val="18"/>
+              </w:rPr>
+              <w:t>银行、PE和上市平台提高集中度；中国金租在2007年后加入全球飞机、船舶市场</w:t>
+            </w:r>
+          </w:p>
+        </w:tc>
+      </w:tr>
+      <w:tr>
+        <w:tc>
+          <w:tcPr>
+            <w:tcW w:type="dxa" w:w="3173"/>
+            <w:shd w:val="clear" w:fill="FFFFFF"/>
+          </w:tcPr>
+          <w:p>
+            <w:pPr>
+              <w:spacing w:before="40" w:after="40" w:line="276" w:lineRule="auto"/>
+            </w:pPr>
+            <w:r/>
+            <w:r>
+              <w:rPr>
+                <w:rFonts w:ascii="Calibri" w:hAnsi="Calibri" w:eastAsia="WenQuanYi Micro Hei"/>
+                <w:b w:val="0"/>
+                <w:i w:val="0"/>
+                <w:sz w:val="18"/>
+              </w:rPr>
+              <w:t>准则与监管再定价</w:t>
+            </w:r>
+          </w:p>
+        </w:tc>
+        <w:tc>
+          <w:tcPr>
+            <w:tcW w:type="dxa" w:w="3173"/>
+            <w:shd w:val="clear" w:fill="FFFFFF"/>
+          </w:tcPr>
+          <w:p>
+            <w:pPr>
+              <w:spacing w:before="40" w:after="40" w:line="276" w:lineRule="auto"/>
+            </w:pPr>
+            <w:r/>
+            <w:r>
+              <w:rPr>
+                <w:rFonts w:ascii="Calibri" w:hAnsi="Calibri" w:eastAsia="WenQuanYi Micro Hei"/>
+                <w:b w:val="0"/>
+                <w:i w:val="0"/>
+                <w:sz w:val="18"/>
+              </w:rPr>
+              <w:t>2016年IFRS 16之后</w:t>
+            </w:r>
+          </w:p>
+        </w:tc>
+        <w:tc>
+          <w:tcPr>
+            <w:tcW w:type="dxa" w:w="3173"/>
+            <w:shd w:val="clear" w:fill="FFFFFF"/>
+          </w:tcPr>
+          <w:p>
+            <w:pPr>
+              <w:spacing w:before="40" w:after="40" w:line="276" w:lineRule="auto"/>
+            </w:pPr>
+            <w:r/>
+            <w:r>
+              <w:rPr>
+                <w:rFonts w:ascii="Calibri" w:hAnsi="Calibri" w:eastAsia="WenQuanYi Micro Hei"/>
+                <w:b w:val="0"/>
+                <w:i w:val="0"/>
+                <w:sz w:val="18"/>
+              </w:rPr>
+              <w:t>承租人表外优势减弱，出租人更靠资产运营能力，而不是“帮忙出表”</w:t>
+            </w:r>
+          </w:p>
+        </w:tc>
+      </w:tr>
+    </w:tbl>
+    <w:p/>
+    <w:p>
+      <w:pPr>
+        <w:spacing w:before="0" w:after="160" w:line="307" w:lineRule="auto"/>
+        <w:ind w:firstLine="420"/>
+      </w:pPr>
+      <w:r>
+        <w:rPr>
+          <w:rFonts w:ascii="Calibri" w:hAnsi="Calibri" w:eastAsia="WenQuanYi Micro Hei"/>
+          <w:b w:val="0"/>
+          <w:i w:val="0"/>
+          <w:sz w:val="22"/>
+        </w:rPr>
+        <w:t xml:space="preserve">White Clarke / Solifi《全球租赁报告》长期显示：北美、欧洲、亚洲合计占全球新增租赁业务的九成以上；美国通常是第一大单一市场，中国自2010年代中期起稳居第二。2024年全球新增租赁业务约 </w:t>
+      </w:r>
+      <w:r>
+        <w:rPr>
+          <w:rFonts w:ascii="Calibri" w:hAnsi="Calibri" w:eastAsia="WenQuanYi Micro Hei"/>
+          <w:b/>
+          <w:i w:val="0"/>
+          <w:sz w:val="22"/>
+        </w:rPr>
+        <w:t>1.54万亿美元</w:t>
+      </w:r>
+      <w:r>
+        <w:rPr>
+          <w:rFonts w:ascii="Calibri" w:hAnsi="Calibri" w:eastAsia="WenQuanYi Micro Hei"/>
+          <w:b w:val="0"/>
+          <w:i w:val="0"/>
+          <w:sz w:val="22"/>
+        </w:rPr>
+        <w:t xml:space="preserve"> 量级，美国新增约 </w:t>
+      </w:r>
+      <w:r>
+        <w:rPr>
+          <w:rFonts w:ascii="Calibri" w:hAnsi="Calibri" w:eastAsia="WenQuanYi Micro Hei"/>
+          <w:b/>
+          <w:i w:val="0"/>
+          <w:sz w:val="22"/>
+        </w:rPr>
+        <w:t>5640亿美元</w:t>
+      </w:r>
+      <w:r>
+        <w:rPr>
+          <w:rFonts w:ascii="Calibri" w:hAnsi="Calibri" w:eastAsia="WenQuanYi Micro Hei"/>
+          <w:b w:val="0"/>
+          <w:i w:val="0"/>
+          <w:sz w:val="22"/>
+        </w:rPr>
+        <w:t>。需要立刻加上口径提醒：这套国际统计含设备租赁、汽车租赁和部分厂商融资，</w:t>
+      </w:r>
+      <w:r>
+        <w:rPr>
+          <w:rFonts w:ascii="Calibri" w:hAnsi="Calibri" w:eastAsia="WenQuanYi Micro Hei"/>
+          <w:b/>
+          <w:i w:val="0"/>
+          <w:sz w:val="22"/>
+        </w:rPr>
+        <w:t>大于且不等于</w:t>
+      </w:r>
+      <w:r>
+        <w:rPr>
+          <w:rFonts w:ascii="Calibri" w:hAnsi="Calibri" w:eastAsia="WenQuanYi Micro Hei"/>
+          <w:b w:val="0"/>
+          <w:i w:val="0"/>
+          <w:sz w:val="22"/>
+        </w:rPr>
+        <w:t>中国持牌金租的5.23万亿元总资产，不能拿来直接比“中国占全球多少”。</w:t>
+      </w:r>
+    </w:p>
+    <w:p>
+      <w:pPr>
+        <w:pStyle w:val="Heading3"/>
+      </w:pPr>
+      <w:r>
+        <w:t>10.3 国际上的代表性机构</w:t>
+      </w:r>
+    </w:p>
+    <w:p>
+      <w:pPr>
+        <w:spacing w:before="0" w:after="160" w:line="307" w:lineRule="auto"/>
+        <w:ind w:firstLine="420"/>
+      </w:pPr>
+      <w:r>
+        <w:rPr>
+          <w:rFonts w:ascii="Calibri" w:hAnsi="Calibri" w:eastAsia="WenQuanYi Micro Hei"/>
+          <w:b w:val="0"/>
+          <w:i w:val="0"/>
+          <w:sz w:val="22"/>
+        </w:rPr>
+        <w:t>按商业模式而不是按中文“金租”标签，全球头部可以分成四类。机队、资产数字随“自有 / 托管 / 订单”口径而变，下表取2025—2026年公开披露的量级，只用来标定位置。</w:t>
+      </w:r>
+    </w:p>
+    <w:p>
+      <w:pPr>
+        <w:spacing w:before="0" w:after="160" w:line="307" w:lineRule="auto"/>
+        <w:ind w:firstLine="420"/>
+      </w:pPr>
+      <w:r>
+        <w:rPr>
+          <w:rFonts w:ascii="Calibri" w:hAnsi="Calibri" w:eastAsia="WenQuanYi Micro Hei"/>
+          <w:b/>
+          <w:i w:val="0"/>
+          <w:sz w:val="22"/>
+        </w:rPr>
+        <w:t>（1）航空专业出租人：最像“以融物为本”的国际样本</w:t>
+      </w:r>
+    </w:p>
+    <w:tbl>
+      <w:tblPr>
+        <w:tblStyle w:val="TableGrid"/>
+        <w:tblW w:type="auto" w:w="0"/>
+        <w:jc w:val="center"/>
+        <w:tblLook w:firstColumn="1" w:firstRow="1" w:lastColumn="0" w:lastRow="0" w:noHBand="0" w:noVBand="1" w:val="04A0"/>
+      </w:tblPr>
+      <w:tblGrid>
+        <w:gridCol w:w="2379"/>
+        <w:gridCol w:w="2379"/>
+        <w:gridCol w:w="2379"/>
+        <w:gridCol w:w="2379"/>
+      </w:tblGrid>
+      <w:tr>
+        <w:tc>
+          <w:tcPr>
+            <w:tcW w:type="dxa" w:w="2379"/>
+            <w:shd w:val="clear" w:fill="1F3A5F"/>
+          </w:tcPr>
+          <w:p>
+            <w:pPr>
+              <w:spacing w:before="40" w:after="40" w:line="276" w:lineRule="auto"/>
+            </w:pPr>
+            <w:r/>
+            <w:r>
+              <w:rPr>
+                <w:rFonts w:ascii="Calibri" w:hAnsi="Calibri" w:eastAsia="WenQuanYi Micro Hei"/>
+                <w:b/>
+                <w:i w:val="0"/>
+                <w:color w:val="FFFFFF"/>
+                <w:sz w:val="18"/>
+              </w:rPr>
+              <w:t>机构</w:t>
+            </w:r>
+          </w:p>
+        </w:tc>
+        <w:tc>
+          <w:tcPr>
+            <w:tcW w:type="dxa" w:w="2379"/>
+            <w:shd w:val="clear" w:fill="1F3A5F"/>
+          </w:tcPr>
+          <w:p>
+            <w:pPr>
+              <w:spacing w:before="40" w:after="40" w:line="276" w:lineRule="auto"/>
+            </w:pPr>
+            <w:r/>
+            <w:r>
+              <w:rPr>
+                <w:rFonts w:ascii="Calibri" w:hAnsi="Calibri" w:eastAsia="WenQuanYi Micro Hei"/>
+                <w:b/>
+                <w:i w:val="0"/>
+                <w:color w:val="FFFFFF"/>
+                <w:sz w:val="18"/>
+              </w:rPr>
+              <w:t>总部 / 上市</w:t>
+            </w:r>
+          </w:p>
+        </w:tc>
+        <w:tc>
+          <w:tcPr>
+            <w:tcW w:type="dxa" w:w="2379"/>
+            <w:shd w:val="clear" w:fill="1F3A5F"/>
+          </w:tcPr>
+          <w:p>
+            <w:pPr>
+              <w:spacing w:before="40" w:after="40" w:line="276" w:lineRule="auto"/>
+            </w:pPr>
+            <w:r/>
+            <w:r>
+              <w:rPr>
+                <w:rFonts w:ascii="Calibri" w:hAnsi="Calibri" w:eastAsia="WenQuanYi Micro Hei"/>
+                <w:b/>
+                <w:i w:val="0"/>
+                <w:color w:val="FFFFFF"/>
+                <w:sz w:val="18"/>
+              </w:rPr>
+              <w:t>源流与位置</w:t>
+            </w:r>
+          </w:p>
+        </w:tc>
+        <w:tc>
+          <w:tcPr>
+            <w:tcW w:type="dxa" w:w="2379"/>
+            <w:shd w:val="clear" w:fill="1F3A5F"/>
+          </w:tcPr>
+          <w:p>
+            <w:pPr>
+              <w:spacing w:before="40" w:after="40" w:line="276" w:lineRule="auto"/>
+            </w:pPr>
+            <w:r/>
+            <w:r>
+              <w:rPr>
+                <w:rFonts w:ascii="Calibri" w:hAnsi="Calibri" w:eastAsia="WenQuanYi Micro Hei"/>
+                <w:b/>
+                <w:i w:val="0"/>
+                <w:color w:val="FFFFFF"/>
+                <w:sz w:val="18"/>
+              </w:rPr>
+              <w:t>规模量级（公开口径）</w:t>
+            </w:r>
+          </w:p>
+        </w:tc>
+      </w:tr>
+      <w:tr>
+        <w:tc>
+          <w:tcPr>
+            <w:tcW w:type="dxa" w:w="2379"/>
+            <w:shd w:val="clear" w:fill="FFFFFF"/>
+          </w:tcPr>
+          <w:p>
+            <w:pPr>
+              <w:spacing w:before="40" w:after="40" w:line="276" w:lineRule="auto"/>
+            </w:pPr>
+            <w:r/>
+            <w:r>
+              <w:rPr>
+                <w:rFonts w:ascii="Calibri" w:hAnsi="Calibri" w:eastAsia="WenQuanYi Micro Hei"/>
+                <w:b/>
+                <w:i w:val="0"/>
+                <w:sz w:val="18"/>
+              </w:rPr>
+              <w:t>AerCap</w:t>
+            </w:r>
+          </w:p>
+        </w:tc>
+        <w:tc>
+          <w:tcPr>
+            <w:tcW w:type="dxa" w:w="2379"/>
+            <w:shd w:val="clear" w:fill="FFFFFF"/>
+          </w:tcPr>
+          <w:p>
+            <w:pPr>
+              <w:spacing w:before="40" w:after="40" w:line="276" w:lineRule="auto"/>
+            </w:pPr>
+            <w:r/>
+            <w:r>
+              <w:rPr>
+                <w:rFonts w:ascii="Calibri" w:hAnsi="Calibri" w:eastAsia="WenQuanYi Micro Hei"/>
+                <w:b w:val="0"/>
+                <w:i w:val="0"/>
+                <w:sz w:val="18"/>
+              </w:rPr>
+              <w:t>都柏林，NYSE: AER</w:t>
+            </w:r>
+          </w:p>
+        </w:tc>
+        <w:tc>
+          <w:tcPr>
+            <w:tcW w:type="dxa" w:w="2379"/>
+            <w:shd w:val="clear" w:fill="FFFFFF"/>
+          </w:tcPr>
+          <w:p>
+            <w:pPr>
+              <w:spacing w:before="40" w:after="40" w:line="276" w:lineRule="auto"/>
+            </w:pPr>
+            <w:r/>
+            <w:r>
+              <w:rPr>
+                <w:rFonts w:ascii="Calibri" w:hAnsi="Calibri" w:eastAsia="WenQuanYi Micro Hei"/>
+                <w:b w:val="0"/>
+                <w:i w:val="0"/>
+                <w:sz w:val="18"/>
+              </w:rPr>
+              <w:t>GPA谱系 + 2014年购ILFC + 2021年购GECAS，全球第一大飞机出租人</w:t>
+            </w:r>
+          </w:p>
+        </w:tc>
+        <w:tc>
+          <w:tcPr>
+            <w:tcW w:type="dxa" w:w="2379"/>
+            <w:shd w:val="clear" w:fill="FFFFFF"/>
+          </w:tcPr>
+          <w:p>
+            <w:pPr>
+              <w:spacing w:before="40" w:after="40" w:line="276" w:lineRule="auto"/>
+            </w:pPr>
+            <w:r/>
+            <w:r>
+              <w:rPr>
+                <w:rFonts w:ascii="Calibri" w:hAnsi="Calibri" w:eastAsia="WenQuanYi Micro Hei"/>
+                <w:b w:val="0"/>
+                <w:i w:val="0"/>
+                <w:sz w:val="18"/>
+              </w:rPr>
+              <w:t>自有及管理机队约1600—1800架；含发动机、直升机后资产组合更大；总资产约700亿美元</w:t>
+            </w:r>
+          </w:p>
+        </w:tc>
+      </w:tr>
+      <w:tr>
+        <w:tc>
+          <w:tcPr>
+            <w:tcW w:type="dxa" w:w="2379"/>
+            <w:shd w:val="clear" w:fill="F4F7FB"/>
+          </w:tcPr>
+          <w:p>
+            <w:pPr>
+              <w:spacing w:before="40" w:after="40" w:line="276" w:lineRule="auto"/>
+            </w:pPr>
+            <w:r/>
+            <w:r>
+              <w:rPr>
+                <w:rFonts w:ascii="Calibri" w:hAnsi="Calibri" w:eastAsia="WenQuanYi Micro Hei"/>
+                <w:b/>
+                <w:i w:val="0"/>
+                <w:sz w:val="18"/>
+              </w:rPr>
+              <w:t>SMBC Aviation Capital</w:t>
+            </w:r>
+          </w:p>
+        </w:tc>
+        <w:tc>
+          <w:tcPr>
+            <w:tcW w:type="dxa" w:w="2379"/>
+            <w:shd w:val="clear" w:fill="F4F7FB"/>
+          </w:tcPr>
+          <w:p>
+            <w:pPr>
+              <w:spacing w:before="40" w:after="40" w:line="276" w:lineRule="auto"/>
+            </w:pPr>
+            <w:r/>
+            <w:r>
+              <w:rPr>
+                <w:rFonts w:ascii="Calibri" w:hAnsi="Calibri" w:eastAsia="WenQuanYi Micro Hei"/>
+                <w:b w:val="0"/>
+                <w:i w:val="0"/>
+                <w:sz w:val="18"/>
+              </w:rPr>
+              <w:t>都柏林</w:t>
+            </w:r>
+          </w:p>
+        </w:tc>
+        <w:tc>
+          <w:tcPr>
+            <w:tcW w:type="dxa" w:w="2379"/>
+            <w:shd w:val="clear" w:fill="F4F7FB"/>
+          </w:tcPr>
+          <w:p>
+            <w:pPr>
+              <w:spacing w:before="40" w:after="40" w:line="276" w:lineRule="auto"/>
+            </w:pPr>
+            <w:r/>
+            <w:r>
+              <w:rPr>
+                <w:rFonts w:ascii="Calibri" w:hAnsi="Calibri" w:eastAsia="WenQuanYi Micro Hei"/>
+                <w:b w:val="0"/>
+                <w:i w:val="0"/>
+                <w:sz w:val="18"/>
+              </w:rPr>
+              <w:t>三井住友金融集团与住友商事控股，2012年接手、2022年购Goshawk</w:t>
+            </w:r>
+          </w:p>
+        </w:tc>
+        <w:tc>
+          <w:tcPr>
+            <w:tcW w:type="dxa" w:w="2379"/>
+            <w:shd w:val="clear" w:fill="F4F7FB"/>
+          </w:tcPr>
+          <w:p>
+            <w:pPr>
+              <w:spacing w:before="40" w:after="40" w:line="276" w:lineRule="auto"/>
+            </w:pPr>
+            <w:r/>
+            <w:r>
+              <w:rPr>
+                <w:rFonts w:ascii="Calibri" w:hAnsi="Calibri" w:eastAsia="WenQuanYi Micro Hei"/>
+                <w:b w:val="0"/>
+                <w:i w:val="0"/>
+                <w:sz w:val="18"/>
+              </w:rPr>
+              <w:t>自有、托管及承诺机队合计可到约1000架量级，通常被列为全球第二</w:t>
+            </w:r>
+          </w:p>
+        </w:tc>
+      </w:tr>
+      <w:tr>
+        <w:tc>
+          <w:tcPr>
+            <w:tcW w:type="dxa" w:w="2379"/>
+            <w:shd w:val="clear" w:fill="FFFFFF"/>
+          </w:tcPr>
+          <w:p>
+            <w:pPr>
+              <w:spacing w:before="40" w:after="40" w:line="276" w:lineRule="auto"/>
+            </w:pPr>
+            <w:r/>
+            <w:r>
+              <w:rPr>
+                <w:rFonts w:ascii="Calibri" w:hAnsi="Calibri" w:eastAsia="WenQuanYi Micro Hei"/>
+                <w:b/>
+                <w:i w:val="0"/>
+                <w:sz w:val="18"/>
+              </w:rPr>
+              <w:t>Avolon</w:t>
+            </w:r>
+          </w:p>
+        </w:tc>
+        <w:tc>
+          <w:tcPr>
+            <w:tcW w:type="dxa" w:w="2379"/>
+            <w:shd w:val="clear" w:fill="FFFFFF"/>
+          </w:tcPr>
+          <w:p>
+            <w:pPr>
+              <w:spacing w:before="40" w:after="40" w:line="276" w:lineRule="auto"/>
+            </w:pPr>
+            <w:r/>
+            <w:r>
+              <w:rPr>
+                <w:rFonts w:ascii="Calibri" w:hAnsi="Calibri" w:eastAsia="WenQuanYi Micro Hei"/>
+                <w:b w:val="0"/>
+                <w:i w:val="0"/>
+                <w:sz w:val="18"/>
+              </w:rPr>
+              <w:t>都柏林</w:t>
+            </w:r>
+          </w:p>
+        </w:tc>
+        <w:tc>
+          <w:tcPr>
+            <w:tcW w:type="dxa" w:w="2379"/>
+            <w:shd w:val="clear" w:fill="FFFFFF"/>
+          </w:tcPr>
+          <w:p>
+            <w:pPr>
+              <w:spacing w:before="40" w:after="40" w:line="276" w:lineRule="auto"/>
+            </w:pPr>
+            <w:r/>
+            <w:r>
+              <w:rPr>
+                <w:rFonts w:ascii="Calibri" w:hAnsi="Calibri" w:eastAsia="WenQuanYi Micro Hei"/>
+                <w:b w:val="0"/>
+                <w:i w:val="0"/>
+                <w:sz w:val="18"/>
+              </w:rPr>
+              <w:t>2010年设立，港交所上市；机队年龄偏低</w:t>
+            </w:r>
+          </w:p>
+        </w:tc>
+        <w:tc>
+          <w:tcPr>
+            <w:tcW w:type="dxa" w:w="2379"/>
+            <w:shd w:val="clear" w:fill="FFFFFF"/>
+          </w:tcPr>
+          <w:p>
+            <w:pPr>
+              <w:spacing w:before="40" w:after="40" w:line="276" w:lineRule="auto"/>
+            </w:pPr>
+            <w:r/>
+            <w:r>
+              <w:rPr>
+                <w:rFonts w:ascii="Calibri" w:hAnsi="Calibri" w:eastAsia="WenQuanYi Micro Hei"/>
+                <w:b w:val="0"/>
+                <w:i w:val="0"/>
+                <w:sz w:val="18"/>
+              </w:rPr>
+              <w:t>自有及管理约600架量级，若含承诺和收购则更高</w:t>
+            </w:r>
+          </w:p>
+        </w:tc>
+      </w:tr>
+      <w:tr>
+        <w:tc>
+          <w:tcPr>
+            <w:tcW w:type="dxa" w:w="2379"/>
+            <w:shd w:val="clear" w:fill="F4F7FB"/>
+          </w:tcPr>
+          <w:p>
+            <w:pPr>
+              <w:spacing w:before="40" w:after="40" w:line="276" w:lineRule="auto"/>
+            </w:pPr>
+            <w:r/>
+            <w:r>
+              <w:rPr>
+                <w:rFonts w:ascii="Calibri" w:hAnsi="Calibri" w:eastAsia="WenQuanYi Micro Hei"/>
+                <w:b/>
+                <w:i w:val="0"/>
+                <w:sz w:val="18"/>
+              </w:rPr>
+              <w:t>Air Lease Corporation</w:t>
+            </w:r>
+          </w:p>
+        </w:tc>
+        <w:tc>
+          <w:tcPr>
+            <w:tcW w:type="dxa" w:w="2379"/>
+            <w:shd w:val="clear" w:fill="F4F7FB"/>
+          </w:tcPr>
+          <w:p>
+            <w:pPr>
+              <w:spacing w:before="40" w:after="40" w:line="276" w:lineRule="auto"/>
+            </w:pPr>
+            <w:r/>
+            <w:r>
+              <w:rPr>
+                <w:rFonts w:ascii="Calibri" w:hAnsi="Calibri" w:eastAsia="WenQuanYi Micro Hei"/>
+                <w:b w:val="0"/>
+                <w:i w:val="0"/>
+                <w:sz w:val="18"/>
+              </w:rPr>
+              <w:t>洛杉矶，NYSE: ALC</w:t>
+            </w:r>
+          </w:p>
+        </w:tc>
+        <w:tc>
+          <w:tcPr>
+            <w:tcW w:type="dxa" w:w="2379"/>
+            <w:shd w:val="clear" w:fill="F4F7FB"/>
+          </w:tcPr>
+          <w:p>
+            <w:pPr>
+              <w:spacing w:before="40" w:after="40" w:line="276" w:lineRule="auto"/>
+            </w:pPr>
+            <w:r/>
+            <w:r>
+              <w:rPr>
+                <w:rFonts w:ascii="Calibri" w:hAnsi="Calibri" w:eastAsia="WenQuanYi Micro Hei"/>
+                <w:b w:val="0"/>
+                <w:i w:val="0"/>
+                <w:sz w:val="18"/>
+              </w:rPr>
+              <w:t>ILFC创始人乌德瓦尔-哈齐再创业</w:t>
+            </w:r>
+          </w:p>
+        </w:tc>
+        <w:tc>
+          <w:tcPr>
+            <w:tcW w:type="dxa" w:w="2379"/>
+            <w:shd w:val="clear" w:fill="F4F7FB"/>
+          </w:tcPr>
+          <w:p>
+            <w:pPr>
+              <w:spacing w:before="40" w:after="40" w:line="276" w:lineRule="auto"/>
+            </w:pPr>
+            <w:r/>
+            <w:r>
+              <w:rPr>
+                <w:rFonts w:ascii="Calibri" w:hAnsi="Calibri" w:eastAsia="WenQuanYi Micro Hei"/>
+                <w:b w:val="0"/>
+                <w:i w:val="0"/>
+                <w:sz w:val="18"/>
+              </w:rPr>
+              <w:t>自有及管理约500—550架</w:t>
+            </w:r>
+          </w:p>
+        </w:tc>
+      </w:tr>
+      <w:tr>
+        <w:tc>
+          <w:tcPr>
+            <w:tcW w:type="dxa" w:w="2379"/>
+            <w:shd w:val="clear" w:fill="FFFFFF"/>
+          </w:tcPr>
+          <w:p>
+            <w:pPr>
+              <w:spacing w:before="40" w:after="40" w:line="276" w:lineRule="auto"/>
+            </w:pPr>
+            <w:r/>
+            <w:r>
+              <w:rPr>
+                <w:rFonts w:ascii="Calibri" w:hAnsi="Calibri" w:eastAsia="WenQuanYi Micro Hei"/>
+                <w:b/>
+                <w:i w:val="0"/>
+                <w:sz w:val="18"/>
+              </w:rPr>
+              <w:t>BOC Aviation</w:t>
+            </w:r>
+          </w:p>
+        </w:tc>
+        <w:tc>
+          <w:tcPr>
+            <w:tcW w:type="dxa" w:w="2379"/>
+            <w:shd w:val="clear" w:fill="FFFFFF"/>
+          </w:tcPr>
+          <w:p>
+            <w:pPr>
+              <w:spacing w:before="40" w:after="40" w:line="276" w:lineRule="auto"/>
+            </w:pPr>
+            <w:r/>
+            <w:r>
+              <w:rPr>
+                <w:rFonts w:ascii="Calibri" w:hAnsi="Calibri" w:eastAsia="WenQuanYi Micro Hei"/>
+                <w:b w:val="0"/>
+                <w:i w:val="0"/>
+                <w:sz w:val="18"/>
+              </w:rPr>
+              <w:t>新加坡，港交所上市</w:t>
+            </w:r>
+          </w:p>
+        </w:tc>
+        <w:tc>
+          <w:tcPr>
+            <w:tcW w:type="dxa" w:w="2379"/>
+            <w:shd w:val="clear" w:fill="FFFFFF"/>
+          </w:tcPr>
+          <w:p>
+            <w:pPr>
+              <w:spacing w:before="40" w:after="40" w:line="276" w:lineRule="auto"/>
+            </w:pPr>
+            <w:r/>
+            <w:r>
+              <w:rPr>
+                <w:rFonts w:ascii="Calibri" w:hAnsi="Calibri" w:eastAsia="WenQuanYi Micro Hei"/>
+                <w:b w:val="0"/>
+                <w:i w:val="0"/>
+                <w:sz w:val="18"/>
+              </w:rPr>
+              <w:t>中国银行控股，中资里最接近国际航空租赁平台的一家</w:t>
+            </w:r>
+          </w:p>
+        </w:tc>
+        <w:tc>
+          <w:tcPr>
+            <w:tcW w:type="dxa" w:w="2379"/>
+            <w:shd w:val="clear" w:fill="FFFFFF"/>
+          </w:tcPr>
+          <w:p>
+            <w:pPr>
+              <w:spacing w:before="40" w:after="40" w:line="276" w:lineRule="auto"/>
+            </w:pPr>
+            <w:r/>
+            <w:r>
+              <w:rPr>
+                <w:rFonts w:ascii="Calibri" w:hAnsi="Calibri" w:eastAsia="WenQuanYi Micro Hei"/>
+                <w:b w:val="0"/>
+                <w:i w:val="0"/>
+                <w:sz w:val="18"/>
+              </w:rPr>
+              <w:t>自有及管理约440架，另有大规模新机订单</w:t>
+            </w:r>
+          </w:p>
+        </w:tc>
+      </w:tr>
+    </w:tbl>
+    <w:p/>
+    <w:p>
+      <w:pPr>
+        <w:spacing w:before="0" w:after="160" w:line="307" w:lineRule="auto"/>
+        <w:ind w:firstLine="420"/>
+      </w:pPr>
+      <w:r>
+        <w:rPr>
+          <w:rFonts w:ascii="Calibri" w:hAnsi="Calibri" w:eastAsia="WenQuanYi Micro Hei"/>
+          <w:b w:val="0"/>
+          <w:i w:val="0"/>
+          <w:sz w:val="22"/>
+        </w:rPr>
+        <w:t>这一组机构的共同点不是“有金融牌照”，而是：</w:t>
+      </w:r>
+      <w:r>
+        <w:rPr>
+          <w:rFonts w:ascii="Calibri" w:hAnsi="Calibri" w:eastAsia="WenQuanYi Micro Hei"/>
+          <w:b/>
+          <w:i w:val="0"/>
+          <w:sz w:val="22"/>
+        </w:rPr>
+        <w:t>会买飞机、会签租约、会在承租人违约后把飞机再租出去。</w:t>
+      </w:r>
+      <w:r>
+        <w:rPr>
+          <w:rFonts w:ascii="Calibri" w:hAnsi="Calibri" w:eastAsia="WenQuanYi Micro Hei"/>
+          <w:b w:val="0"/>
+          <w:i w:val="0"/>
+          <w:sz w:val="22"/>
+        </w:rPr>
+        <w:t xml:space="preserve"> 中国金租里的交银、国银、工银航空板块，组织形态更接近它们，而不是接近做城投回租的区域金租。</w:t>
+      </w:r>
+    </w:p>
+    <w:p>
+      <w:pPr>
+        <w:spacing w:before="0" w:after="160" w:line="307" w:lineRule="auto"/>
+        <w:ind w:firstLine="420"/>
+      </w:pPr>
+      <w:r>
+        <w:rPr>
+          <w:rFonts w:ascii="Calibri" w:hAnsi="Calibri" w:eastAsia="WenQuanYi Micro Hei"/>
+          <w:b/>
+          <w:i w:val="0"/>
+          <w:sz w:val="22"/>
+        </w:rPr>
+        <w:t>（2）综合租赁与银行系平台：日本和欧洲的“金租近亲”</w:t>
+      </w:r>
+    </w:p>
+    <w:tbl>
+      <w:tblPr>
+        <w:tblStyle w:val="TableGrid"/>
+        <w:tblW w:type="auto" w:w="0"/>
+        <w:jc w:val="center"/>
+        <w:tblLook w:firstColumn="1" w:firstRow="1" w:lastColumn="0" w:lastRow="0" w:noHBand="0" w:noVBand="1" w:val="04A0"/>
+      </w:tblPr>
+      <w:tblGrid>
+        <w:gridCol w:w="3173"/>
+        <w:gridCol w:w="3173"/>
+        <w:gridCol w:w="3173"/>
+      </w:tblGrid>
+      <w:tr>
+        <w:tc>
+          <w:tcPr>
+            <w:tcW w:type="dxa" w:w="3173"/>
+            <w:shd w:val="clear" w:fill="1F3A5F"/>
+          </w:tcPr>
+          <w:p>
+            <w:pPr>
+              <w:spacing w:before="40" w:after="40" w:line="276" w:lineRule="auto"/>
+            </w:pPr>
+            <w:r/>
+            <w:r>
+              <w:rPr>
+                <w:rFonts w:ascii="Calibri" w:hAnsi="Calibri" w:eastAsia="WenQuanYi Micro Hei"/>
+                <w:b/>
+                <w:i w:val="0"/>
+                <w:color w:val="FFFFFF"/>
+                <w:sz w:val="18"/>
+              </w:rPr>
+              <w:t>机构</w:t>
+            </w:r>
+          </w:p>
+        </w:tc>
+        <w:tc>
+          <w:tcPr>
+            <w:tcW w:type="dxa" w:w="3173"/>
+            <w:shd w:val="clear" w:fill="1F3A5F"/>
+          </w:tcPr>
+          <w:p>
+            <w:pPr>
+              <w:spacing w:before="40" w:after="40" w:line="276" w:lineRule="auto"/>
+            </w:pPr>
+            <w:r/>
+            <w:r>
+              <w:rPr>
+                <w:rFonts w:ascii="Calibri" w:hAnsi="Calibri" w:eastAsia="WenQuanYi Micro Hei"/>
+                <w:b/>
+                <w:i w:val="0"/>
+                <w:color w:val="FFFFFF"/>
+                <w:sz w:val="18"/>
+              </w:rPr>
+              <w:t>所属谱系</w:t>
+            </w:r>
+          </w:p>
+        </w:tc>
+        <w:tc>
+          <w:tcPr>
+            <w:tcW w:type="dxa" w:w="3173"/>
+            <w:shd w:val="clear" w:fill="1F3A5F"/>
+          </w:tcPr>
+          <w:p>
+            <w:pPr>
+              <w:spacing w:before="40" w:after="40" w:line="276" w:lineRule="auto"/>
+            </w:pPr>
+            <w:r/>
+            <w:r>
+              <w:rPr>
+                <w:rFonts w:ascii="Calibri" w:hAnsi="Calibri" w:eastAsia="WenQuanYi Micro Hei"/>
+                <w:b/>
+                <w:i w:val="0"/>
+                <w:color w:val="FFFFFF"/>
+                <w:sz w:val="18"/>
+              </w:rPr>
+              <w:t>为什么重要</w:t>
+            </w:r>
+          </w:p>
+        </w:tc>
+      </w:tr>
+      <w:tr>
+        <w:tc>
+          <w:tcPr>
+            <w:tcW w:type="dxa" w:w="3173"/>
+            <w:shd w:val="clear" w:fill="FFFFFF"/>
+          </w:tcPr>
+          <w:p>
+            <w:pPr>
+              <w:spacing w:before="40" w:after="40" w:line="276" w:lineRule="auto"/>
+            </w:pPr>
+            <w:r/>
+            <w:r>
+              <w:rPr>
+                <w:rFonts w:ascii="Calibri" w:hAnsi="Calibri" w:eastAsia="WenQuanYi Micro Hei"/>
+                <w:b/>
+                <w:i w:val="0"/>
+                <w:sz w:val="18"/>
+              </w:rPr>
+              <w:t>欧力士（ORIX）</w:t>
+            </w:r>
+          </w:p>
+        </w:tc>
+        <w:tc>
+          <w:tcPr>
+            <w:tcW w:type="dxa" w:w="3173"/>
+            <w:shd w:val="clear" w:fill="FFFFFF"/>
+          </w:tcPr>
+          <w:p>
+            <w:pPr>
+              <w:spacing w:before="40" w:after="40" w:line="276" w:lineRule="auto"/>
+            </w:pPr>
+            <w:r/>
+            <w:r>
+              <w:rPr>
+                <w:rFonts w:ascii="Calibri" w:hAnsi="Calibri" w:eastAsia="WenQuanYi Micro Hei"/>
+                <w:b w:val="0"/>
+                <w:i w:val="0"/>
+                <w:sz w:val="18"/>
+              </w:rPr>
+              <w:t>1964年东方租赁，1989年更名；东京/纽约两地上市</w:t>
+            </w:r>
+          </w:p>
+        </w:tc>
+        <w:tc>
+          <w:tcPr>
+            <w:tcW w:type="dxa" w:w="3173"/>
+            <w:shd w:val="clear" w:fill="FFFFFF"/>
+          </w:tcPr>
+          <w:p>
+            <w:pPr>
+              <w:spacing w:before="40" w:after="40" w:line="276" w:lineRule="auto"/>
+            </w:pPr>
+            <w:r/>
+            <w:r>
+              <w:rPr>
+                <w:rFonts w:ascii="Calibri" w:hAnsi="Calibri" w:eastAsia="WenQuanYi Micro Hei"/>
+                <w:b w:val="0"/>
+                <w:i w:val="0"/>
+                <w:sz w:val="18"/>
+              </w:rPr>
+              <w:t>从设备租赁长成涵盖租赁、贷款、保险、不动产和海外投资的综合金融集团，是“租赁公司可以长多大”的上限样本</w:t>
+            </w:r>
+          </w:p>
+        </w:tc>
+      </w:tr>
+      <w:tr>
+        <w:tc>
+          <w:tcPr>
+            <w:tcW w:type="dxa" w:w="3173"/>
+            <w:shd w:val="clear" w:fill="F4F7FB"/>
+          </w:tcPr>
+          <w:p>
+            <w:pPr>
+              <w:spacing w:before="40" w:after="40" w:line="276" w:lineRule="auto"/>
+            </w:pPr>
+            <w:r/>
+            <w:r>
+              <w:rPr>
+                <w:rFonts w:ascii="Calibri" w:hAnsi="Calibri" w:eastAsia="WenQuanYi Micro Hei"/>
+                <w:b/>
+                <w:i w:val="0"/>
+                <w:sz w:val="18"/>
+              </w:rPr>
+              <w:t>三菱HC资本（Mitsubishi HC Capital）</w:t>
+            </w:r>
+          </w:p>
+        </w:tc>
+        <w:tc>
+          <w:tcPr>
+            <w:tcW w:type="dxa" w:w="3173"/>
+            <w:shd w:val="clear" w:fill="F4F7FB"/>
+          </w:tcPr>
+          <w:p>
+            <w:pPr>
+              <w:spacing w:before="40" w:after="40" w:line="276" w:lineRule="auto"/>
+            </w:pPr>
+            <w:r/>
+            <w:r>
+              <w:rPr>
+                <w:rFonts w:ascii="Calibri" w:hAnsi="Calibri" w:eastAsia="WenQuanYi Micro Hei"/>
+                <w:b w:val="0"/>
+                <w:i w:val="0"/>
+                <w:sz w:val="18"/>
+              </w:rPr>
+              <w:t>2021年三菱UFJ租赁与日立资本合并</w:t>
+            </w:r>
+          </w:p>
+        </w:tc>
+        <w:tc>
+          <w:tcPr>
+            <w:tcW w:type="dxa" w:w="3173"/>
+            <w:shd w:val="clear" w:fill="F4F7FB"/>
+          </w:tcPr>
+          <w:p>
+            <w:pPr>
+              <w:spacing w:before="40" w:after="40" w:line="276" w:lineRule="auto"/>
+            </w:pPr>
+            <w:r/>
+            <w:r>
+              <w:rPr>
+                <w:rFonts w:ascii="Calibri" w:hAnsi="Calibri" w:eastAsia="WenQuanYi Micro Hei"/>
+                <w:b w:val="0"/>
+                <w:i w:val="0"/>
+                <w:sz w:val="18"/>
+              </w:rPr>
+              <w:t>同时有大银行股东和厂商基因，覆盖国内设备、汽车、海外基础设施和航空</w:t>
+            </w:r>
+          </w:p>
+        </w:tc>
+      </w:tr>
+      <w:tr>
+        <w:tc>
+          <w:tcPr>
+            <w:tcW w:type="dxa" w:w="3173"/>
+            <w:shd w:val="clear" w:fill="FFFFFF"/>
+          </w:tcPr>
+          <w:p>
+            <w:pPr>
+              <w:spacing w:before="40" w:after="40" w:line="276" w:lineRule="auto"/>
+            </w:pPr>
+            <w:r/>
+            <w:r>
+              <w:rPr>
+                <w:rFonts w:ascii="Calibri" w:hAnsi="Calibri" w:eastAsia="WenQuanYi Micro Hei"/>
+                <w:b/>
+                <w:i w:val="0"/>
+                <w:sz w:val="18"/>
+              </w:rPr>
+              <w:t>东京世纪（Tokyo Century）</w:t>
+            </w:r>
+          </w:p>
+        </w:tc>
+        <w:tc>
+          <w:tcPr>
+            <w:tcW w:type="dxa" w:w="3173"/>
+            <w:shd w:val="clear" w:fill="FFFFFF"/>
+          </w:tcPr>
+          <w:p>
+            <w:pPr>
+              <w:spacing w:before="40" w:after="40" w:line="276" w:lineRule="auto"/>
+            </w:pPr>
+            <w:r/>
+            <w:r>
+              <w:rPr>
+                <w:rFonts w:ascii="Calibri" w:hAnsi="Calibri" w:eastAsia="WenQuanYi Micro Hei"/>
+                <w:b w:val="0"/>
+                <w:i w:val="0"/>
+                <w:sz w:val="18"/>
+              </w:rPr>
+              <w:t>伊藤忠、中信、金融机构共同背景</w:t>
+            </w:r>
+          </w:p>
+        </w:tc>
+        <w:tc>
+          <w:tcPr>
+            <w:tcW w:type="dxa" w:w="3173"/>
+            <w:shd w:val="clear" w:fill="FFFFFF"/>
+          </w:tcPr>
+          <w:p>
+            <w:pPr>
+              <w:spacing w:before="40" w:after="40" w:line="276" w:lineRule="auto"/>
+            </w:pPr>
+            <w:r/>
+            <w:r>
+              <w:rPr>
+                <w:rFonts w:ascii="Calibri" w:hAnsi="Calibri" w:eastAsia="WenQuanYi Micro Hei"/>
+                <w:b w:val="0"/>
+                <w:i w:val="0"/>
+                <w:sz w:val="18"/>
+              </w:rPr>
+              <w:t>日本租赁第三极，深度绑定厂商与汽车</w:t>
+            </w:r>
+          </w:p>
+        </w:tc>
+      </w:tr>
+      <w:tr>
+        <w:tc>
+          <w:tcPr>
+            <w:tcW w:type="dxa" w:w="3173"/>
+            <w:shd w:val="clear" w:fill="F4F7FB"/>
+          </w:tcPr>
+          <w:p>
+            <w:pPr>
+              <w:spacing w:before="40" w:after="40" w:line="276" w:lineRule="auto"/>
+            </w:pPr>
+            <w:r/>
+            <w:r>
+              <w:rPr>
+                <w:rFonts w:ascii="Calibri" w:hAnsi="Calibri" w:eastAsia="WenQuanYi Micro Hei"/>
+                <w:b/>
+                <w:i w:val="0"/>
+                <w:sz w:val="18"/>
+              </w:rPr>
+              <w:t>DLL（De Lage Landen）</w:t>
+            </w:r>
+          </w:p>
+        </w:tc>
+        <w:tc>
+          <w:tcPr>
+            <w:tcW w:type="dxa" w:w="3173"/>
+            <w:shd w:val="clear" w:fill="F4F7FB"/>
+          </w:tcPr>
+          <w:p>
+            <w:pPr>
+              <w:spacing w:before="40" w:after="40" w:line="276" w:lineRule="auto"/>
+            </w:pPr>
+            <w:r/>
+            <w:r>
+              <w:rPr>
+                <w:rFonts w:ascii="Calibri" w:hAnsi="Calibri" w:eastAsia="WenQuanYi Micro Hei"/>
+                <w:b w:val="0"/>
+                <w:i w:val="0"/>
+                <w:sz w:val="18"/>
+              </w:rPr>
+              <w:t>荷兰合作银行全资</w:t>
+            </w:r>
+          </w:p>
+        </w:tc>
+        <w:tc>
+          <w:tcPr>
+            <w:tcW w:type="dxa" w:w="3173"/>
+            <w:shd w:val="clear" w:fill="F4F7FB"/>
+          </w:tcPr>
+          <w:p>
+            <w:pPr>
+              <w:spacing w:before="40" w:after="40" w:line="276" w:lineRule="auto"/>
+            </w:pPr>
+            <w:r/>
+            <w:r>
+              <w:rPr>
+                <w:rFonts w:ascii="Calibri" w:hAnsi="Calibri" w:eastAsia="WenQuanYi Micro Hei"/>
+                <w:b w:val="0"/>
+                <w:i w:val="0"/>
+                <w:sz w:val="18"/>
+              </w:rPr>
+              <w:t>全球最典型的厂商租赁平台之一，深耕农业、工程机械、医疗、食品设备</w:t>
+            </w:r>
+          </w:p>
+        </w:tc>
+      </w:tr>
+      <w:tr>
+        <w:tc>
+          <w:tcPr>
+            <w:tcW w:type="dxa" w:w="3173"/>
+            <w:shd w:val="clear" w:fill="FFFFFF"/>
+          </w:tcPr>
+          <w:p>
+            <w:pPr>
+              <w:spacing w:before="40" w:after="40" w:line="276" w:lineRule="auto"/>
+            </w:pPr>
+            <w:r/>
+            <w:r>
+              <w:rPr>
+                <w:rFonts w:ascii="Calibri" w:hAnsi="Calibri" w:eastAsia="WenQuanYi Micro Hei"/>
+                <w:b/>
+                <w:i w:val="0"/>
+                <w:sz w:val="18"/>
+              </w:rPr>
+              <w:t>BNP Paribas Leasing Solutions / 法兴设备金融（SGEF）</w:t>
+            </w:r>
+          </w:p>
+        </w:tc>
+        <w:tc>
+          <w:tcPr>
+            <w:tcW w:type="dxa" w:w="3173"/>
+            <w:shd w:val="clear" w:fill="FFFFFF"/>
+          </w:tcPr>
+          <w:p>
+            <w:pPr>
+              <w:spacing w:before="40" w:after="40" w:line="276" w:lineRule="auto"/>
+            </w:pPr>
+            <w:r/>
+            <w:r>
+              <w:rPr>
+                <w:rFonts w:ascii="Calibri" w:hAnsi="Calibri" w:eastAsia="WenQuanYi Micro Hei"/>
+                <w:b w:val="0"/>
+                <w:i w:val="0"/>
+                <w:sz w:val="18"/>
+              </w:rPr>
+              <w:t>法国巴黎银行、法国兴业银行</w:t>
+            </w:r>
+          </w:p>
+        </w:tc>
+        <w:tc>
+          <w:tcPr>
+            <w:tcW w:type="dxa" w:w="3173"/>
+            <w:shd w:val="clear" w:fill="FFFFFF"/>
+          </w:tcPr>
+          <w:p>
+            <w:pPr>
+              <w:spacing w:before="40" w:after="40" w:line="276" w:lineRule="auto"/>
+            </w:pPr>
+            <w:r/>
+            <w:r>
+              <w:rPr>
+                <w:rFonts w:ascii="Calibri" w:hAnsi="Calibri" w:eastAsia="WenQuanYi Micro Hei"/>
+                <w:b w:val="0"/>
+                <w:i w:val="0"/>
+                <w:sz w:val="18"/>
+              </w:rPr>
+              <w:t>欧洲银行系设备租赁的代表，客户以中小企业和厂商渠道为主</w:t>
+            </w:r>
+          </w:p>
+        </w:tc>
+      </w:tr>
+      <w:tr>
+        <w:tc>
+          <w:tcPr>
+            <w:tcW w:type="dxa" w:w="3173"/>
+            <w:shd w:val="clear" w:fill="F4F7FB"/>
+          </w:tcPr>
+          <w:p>
+            <w:pPr>
+              <w:spacing w:before="40" w:after="40" w:line="276" w:lineRule="auto"/>
+            </w:pPr>
+            <w:r/>
+            <w:r>
+              <w:rPr>
+                <w:rFonts w:ascii="Calibri" w:hAnsi="Calibri" w:eastAsia="WenQuanYi Micro Hei"/>
+                <w:b/>
+                <w:i w:val="0"/>
+                <w:sz w:val="18"/>
+              </w:rPr>
+              <w:t>西门子金融（Siemens Financial Services）</w:t>
+            </w:r>
+          </w:p>
+        </w:tc>
+        <w:tc>
+          <w:tcPr>
+            <w:tcW w:type="dxa" w:w="3173"/>
+            <w:shd w:val="clear" w:fill="F4F7FB"/>
+          </w:tcPr>
+          <w:p>
+            <w:pPr>
+              <w:spacing w:before="40" w:after="40" w:line="276" w:lineRule="auto"/>
+            </w:pPr>
+            <w:r/>
+            <w:r>
+              <w:rPr>
+                <w:rFonts w:ascii="Calibri" w:hAnsi="Calibri" w:eastAsia="WenQuanYi Micro Hei"/>
+                <w:b w:val="0"/>
+                <w:i w:val="0"/>
+                <w:sz w:val="18"/>
+              </w:rPr>
+              <w:t>产业集团财务公司</w:t>
+            </w:r>
+          </w:p>
+        </w:tc>
+        <w:tc>
+          <w:tcPr>
+            <w:tcW w:type="dxa" w:w="3173"/>
+            <w:shd w:val="clear" w:fill="F4F7FB"/>
+          </w:tcPr>
+          <w:p>
+            <w:pPr>
+              <w:spacing w:before="40" w:after="40" w:line="276" w:lineRule="auto"/>
+            </w:pPr>
+            <w:r/>
+            <w:r>
+              <w:rPr>
+                <w:rFonts w:ascii="Calibri" w:hAnsi="Calibri" w:eastAsia="WenQuanYi Micro Hei"/>
+                <w:b w:val="0"/>
+                <w:i w:val="0"/>
+                <w:sz w:val="18"/>
+              </w:rPr>
+              <w:t>厂商租赁的德国样本：租赁是销售的延伸，不是独立的类信贷</w:t>
+            </w:r>
+          </w:p>
+        </w:tc>
+      </w:tr>
+    </w:tbl>
+    <w:p/>
+    <w:p>
+      <w:pPr>
+        <w:spacing w:before="0" w:after="160" w:line="307" w:lineRule="auto"/>
+        <w:ind w:firstLine="420"/>
+      </w:pPr>
+      <w:r>
+        <w:rPr>
+          <w:rFonts w:ascii="Calibri" w:hAnsi="Calibri" w:eastAsia="WenQuanYi Micro Hei"/>
+          <w:b w:val="0"/>
+          <w:i w:val="0"/>
+          <w:sz w:val="22"/>
+        </w:rPr>
+        <w:t>对中国读者，这类机构比AerCap更有对照价值。它们证明：银行或产业股东可以成为租赁公司的优势，前提是租赁公司必须发展出自己的资产能力和厂商渠道，而不是只做股东的出表管道。日本综合租赁尤其接近中国金租的组织想象——银行系、服务制造业、可以做大——但日本的客户锁定来自主银行关系和长期设备循环，不是来自城投回租。</w:t>
+      </w:r>
+    </w:p>
+    <w:p>
+      <w:pPr>
+        <w:spacing w:before="0" w:after="160" w:line="307" w:lineRule="auto"/>
+        <w:ind w:firstLine="420"/>
+      </w:pPr>
+      <w:r>
+        <w:rPr>
+          <w:rFonts w:ascii="Calibri" w:hAnsi="Calibri" w:eastAsia="WenQuanYi Micro Hei"/>
+          <w:b/>
+          <w:i w:val="0"/>
+          <w:sz w:val="22"/>
+        </w:rPr>
+        <w:t>（3）厂商财务公司与汽车租赁：租赁渗透率真正高的地方</w:t>
+      </w:r>
+    </w:p>
+    <w:p>
+      <w:pPr>
+        <w:spacing w:before="0" w:after="160" w:line="307" w:lineRule="auto"/>
+        <w:ind w:firstLine="420"/>
+      </w:pPr>
+      <w:r>
+        <w:rPr>
+          <w:rFonts w:ascii="Calibri" w:hAnsi="Calibri" w:eastAsia="WenQuanYi Micro Hei"/>
+          <w:b w:val="0"/>
+          <w:i w:val="0"/>
+          <w:sz w:val="22"/>
+        </w:rPr>
+        <w:t>卡特彼勒金融、约翰迪尔金融、沃尔沃金融服务等，把融资租赁嵌进设备经销体系，是欧美租赁渗透率（租赁占设备投资的比重）长期高于中国的微观原因。汽车方面，Ayvens（原ALD与LeasePlan合并，法兴集团）和Element Fleet代表车辆全生命周期运营，收入来自租金、残值、维护和保险，而不是利差。中国金租若只在对公大项目上找直租，会错过国际上体量最大的租赁场景。</w:t>
+      </w:r>
+    </w:p>
+    <w:p>
+      <w:pPr>
+        <w:spacing w:before="0" w:after="160" w:line="307" w:lineRule="auto"/>
+        <w:ind w:firstLine="420"/>
+      </w:pPr>
+      <w:r>
+        <w:rPr>
+          <w:rFonts w:ascii="Calibri" w:hAnsi="Calibri" w:eastAsia="WenQuanYi Micro Hei"/>
+          <w:b/>
+          <w:i w:val="0"/>
+          <w:sz w:val="22"/>
+        </w:rPr>
+        <w:t>（4）中国金租的国际面</w:t>
+      </w:r>
+    </w:p>
+    <w:p>
+      <w:pPr>
+        <w:spacing w:before="0" w:after="160" w:line="307" w:lineRule="auto"/>
+        <w:ind w:firstLine="420"/>
+      </w:pPr>
+      <w:r>
+        <w:rPr>
+          <w:rFonts w:ascii="Calibri" w:hAnsi="Calibri" w:eastAsia="WenQuanYi Micro Hei"/>
+          <w:b w:val="0"/>
+          <w:i w:val="0"/>
+          <w:sz w:val="22"/>
+        </w:rPr>
+        <w:t>工银金租、交银金租、国银金租已经是全球飞机、船舶租赁的重要参与者，机队和船队规模进入世界前列；中银航空租赁则是标准的国际化专业平台。它们在海外被同行视为lessor，在国内被监管视为金融租赁公司。双重身份带来的好处是低成本人民币和美元负债，约束是并表资本、集中度和国内回租转型必须同时完成。</w:t>
+      </w:r>
+    </w:p>
+    <w:p>
+      <w:pPr>
+        <w:pStyle w:val="Heading3"/>
+      </w:pPr>
+      <w:r>
+        <w:t>10.4 双轨制为什么还在</w:t>
+      </w:r>
+    </w:p>
+    <w:p>
+      <w:pPr>
+        <w:spacing w:before="0" w:after="160" w:line="307" w:lineRule="auto"/>
+        <w:ind w:firstLine="420"/>
+      </w:pPr>
+      <w:r>
+        <w:rPr>
+          <w:rFonts w:ascii="Calibri" w:hAnsi="Calibri" w:eastAsia="WenQuanYi Micro Hei"/>
+          <w:b w:val="0"/>
+          <w:i w:val="0"/>
+          <w:sz w:val="22"/>
+        </w:rPr>
+        <w:t>中国租赁市场长期并行两套牌照。金租少而强，商租多而弱。2018年机构改革后，商租从商务部划转至地方金融管理部门，监管趋势与金租趋同：强调租赁物、限制通道、支持设备更新。中诚信等机构预计，商租监管将继续向金租靠拢，但短期内不会获得同业拆借和金融债的同等待遇。</w:t>
+      </w:r>
+    </w:p>
+    <w:p>
+      <w:pPr>
+        <w:spacing w:before="0" w:after="160" w:line="307" w:lineRule="auto"/>
+        <w:ind w:firstLine="420"/>
+      </w:pPr>
+      <w:r>
+        <w:rPr>
+          <w:rFonts w:ascii="Calibri" w:hAnsi="Calibri" w:eastAsia="WenQuanYi Micro Hei"/>
+          <w:b w:val="0"/>
+          <w:i w:val="0"/>
+          <w:sz w:val="22"/>
+        </w:rPr>
+        <w:t>功能分工可以是健康的：金租做大额、跨境、重资产和资本密集型项目；商租做区域、厂商、中小设备。风险在于：商租在地方债务和通道业务出清后，同样面临转型，部分主体可能把风险资产转向金租无法做的灰色地带，或反过来成为金租的“出表通道”——这正是联合租赁、资产转让规则要堵住的口子。2024年办法要求租赁资产转让必须真实、完整、洁净，不得回购、差额补足或抽屉协议。</w:t>
+      </w:r>
+    </w:p>
+    <w:p>
+      <w:pPr>
+        <w:pStyle w:val="Heading3"/>
+      </w:pPr>
+      <w:r>
+        <w:t>10.5 对中国金租的启示</w:t>
       </w:r>
     </w:p>
     <w:tbl>
@@ -8579,7 +10446,7 @@
           <w:i w:val="0"/>
           <w:sz w:val="22"/>
         </w:rPr>
-        <w:t>中国金租的独特性在于：</w:t>
+        <w:t>把国际源流对照过来，中国金租的位置可以收成一句：</w:t>
       </w:r>
       <w:r>
         <w:rPr>
@@ -8588,7 +10455,7 @@
           <w:i w:val="0"/>
           <w:sz w:val="22"/>
         </w:rPr>
-        <w:t>它是银行主导金融体系里被单独牌照化、又被要求像租赁公司一样做事的机构。</w:t>
+        <w:t>牌照是中国的，生意逻辑是美国1950年代发明、日本和爱尔兰后来做成熟的。</w:t>
       </w:r>
       <w:r>
         <w:rPr>
@@ -8597,7 +10464,7 @@
           <w:i w:val="0"/>
           <w:sz w:val="22"/>
         </w:rPr>
-        <w:t xml:space="preserve"> 所以它既不会变成美国式的独立租赁商，也不会退回普通对公贷款。成功的稳态，更接近“银行子公司 + 专业资产管理机构”：负债和客户协同来自银行，定价、残值和再营销来自租赁。</w:t>
+        <w:t xml:space="preserve"> 它既不会变成美国式的独立租赁商，也不会退回普通对公贷款。成功的稳态，更接近“银行子公司 + 专业资产管理机构”：负债和客户协同来自银行，定价、残值和再营销来自租赁。这正是AerCap、ORIX和DLL分别证明过的三条路径——专业化资产平台、综合金融集团、厂商渠道——而不是再做一轮类信贷。</w:t>
       </w:r>
     </w:p>
     <w:p>
@@ -10115,7 +11982,514 @@
         <w:pStyle w:val="Heading3"/>
       </w:pPr>
       <w:r>
-        <w:t>附录C 概念对照（避免混用）</w:t>
+        <w:t>附录C 国际租赁简明年表</w:t>
+      </w:r>
+    </w:p>
+    <w:tbl>
+      <w:tblPr>
+        <w:tblStyle w:val="TableGrid"/>
+        <w:tblW w:type="auto" w:w="0"/>
+        <w:jc w:val="center"/>
+        <w:tblLook w:firstColumn="1" w:firstRow="1" w:lastColumn="0" w:lastRow="0" w:noHBand="0" w:noVBand="1" w:val="04A0"/>
+      </w:tblPr>
+      <w:tblGrid>
+        <w:gridCol w:w="4759"/>
+        <w:gridCol w:w="4759"/>
+      </w:tblGrid>
+      <w:tr>
+        <w:tc>
+          <w:tcPr>
+            <w:tcW w:type="dxa" w:w="4759"/>
+            <w:shd w:val="clear" w:fill="1F3A5F"/>
+          </w:tcPr>
+          <w:p>
+            <w:pPr>
+              <w:spacing w:before="40" w:after="40" w:line="276" w:lineRule="auto"/>
+            </w:pPr>
+            <w:r/>
+            <w:r>
+              <w:rPr>
+                <w:rFonts w:ascii="Calibri" w:hAnsi="Calibri" w:eastAsia="WenQuanYi Micro Hei"/>
+                <w:b/>
+                <w:i w:val="0"/>
+                <w:color w:val="FFFFFF"/>
+                <w:sz w:val="18"/>
+              </w:rPr>
+              <w:t>时间</w:t>
+            </w:r>
+          </w:p>
+        </w:tc>
+        <w:tc>
+          <w:tcPr>
+            <w:tcW w:type="dxa" w:w="4759"/>
+            <w:shd w:val="clear" w:fill="1F3A5F"/>
+          </w:tcPr>
+          <w:p>
+            <w:pPr>
+              <w:spacing w:before="40" w:after="40" w:line="276" w:lineRule="auto"/>
+            </w:pPr>
+            <w:r/>
+            <w:r>
+              <w:rPr>
+                <w:rFonts w:ascii="Calibri" w:hAnsi="Calibri" w:eastAsia="WenQuanYi Micro Hei"/>
+                <w:b/>
+                <w:i w:val="0"/>
+                <w:color w:val="FFFFFF"/>
+                <w:sz w:val="18"/>
+              </w:rPr>
+              <w:t>事项</w:t>
+            </w:r>
+          </w:p>
+        </w:tc>
+      </w:tr>
+      <w:tr>
+        <w:tc>
+          <w:tcPr>
+            <w:tcW w:type="dxa" w:w="4759"/>
+            <w:shd w:val="clear" w:fill="FFFFFF"/>
+          </w:tcPr>
+          <w:p>
+            <w:pPr>
+              <w:spacing w:before="40" w:after="40" w:line="276" w:lineRule="auto"/>
+            </w:pPr>
+            <w:r/>
+            <w:r>
+              <w:rPr>
+                <w:rFonts w:ascii="Calibri" w:hAnsi="Calibri" w:eastAsia="WenQuanYi Micro Hei"/>
+                <w:b w:val="0"/>
+                <w:i w:val="0"/>
+                <w:sz w:val="18"/>
+              </w:rPr>
+              <w:t>古代至中世纪</w:t>
+            </w:r>
+          </w:p>
+        </w:tc>
+        <w:tc>
+          <w:tcPr>
+            <w:tcW w:type="dxa" w:w="4759"/>
+            <w:shd w:val="clear" w:fill="FFFFFF"/>
+          </w:tcPr>
+          <w:p>
+            <w:pPr>
+              <w:spacing w:before="40" w:after="40" w:line="276" w:lineRule="auto"/>
+            </w:pPr>
+            <w:r/>
+            <w:r>
+              <w:rPr>
+                <w:rFonts w:ascii="Calibri" w:hAnsi="Calibri" w:eastAsia="WenQuanYi Micro Hei"/>
+                <w:b w:val="0"/>
+                <w:i w:val="0"/>
+                <w:sz w:val="18"/>
+              </w:rPr>
+              <w:t>两河流域租约、《汉谟拉比法典》；商船、农具、房屋的使用让渡</w:t>
+            </w:r>
+          </w:p>
+        </w:tc>
+      </w:tr>
+      <w:tr>
+        <w:tc>
+          <w:tcPr>
+            <w:tcW w:type="dxa" w:w="4759"/>
+            <w:shd w:val="clear" w:fill="F4F7FB"/>
+          </w:tcPr>
+          <w:p>
+            <w:pPr>
+              <w:spacing w:before="40" w:after="40" w:line="276" w:lineRule="auto"/>
+            </w:pPr>
+            <w:r/>
+            <w:r>
+              <w:rPr>
+                <w:rFonts w:ascii="Calibri" w:hAnsi="Calibri" w:eastAsia="WenQuanYi Micro Hei"/>
+                <w:b w:val="0"/>
+                <w:i w:val="0"/>
+                <w:sz w:val="18"/>
+              </w:rPr>
+              <w:t>19世纪后期</w:t>
+            </w:r>
+          </w:p>
+        </w:tc>
+        <w:tc>
+          <w:tcPr>
+            <w:tcW w:type="dxa" w:w="4759"/>
+            <w:shd w:val="clear" w:fill="F4F7FB"/>
+          </w:tcPr>
+          <w:p>
+            <w:pPr>
+              <w:spacing w:before="40" w:after="40" w:line="276" w:lineRule="auto"/>
+            </w:pPr>
+            <w:r/>
+            <w:r>
+              <w:rPr>
+                <w:rFonts w:ascii="Calibri" w:hAnsi="Calibri" w:eastAsia="WenQuanYi Micro Hei"/>
+                <w:b w:val="0"/>
+                <w:i w:val="0"/>
+                <w:sz w:val="18"/>
+              </w:rPr>
+              <w:t>美国铁路设备信托，物权融资成型</w:t>
+            </w:r>
+          </w:p>
+        </w:tc>
+      </w:tr>
+      <w:tr>
+        <w:tc>
+          <w:tcPr>
+            <w:tcW w:type="dxa" w:w="4759"/>
+            <w:shd w:val="clear" w:fill="FFFFFF"/>
+          </w:tcPr>
+          <w:p>
+            <w:pPr>
+              <w:spacing w:before="40" w:after="40" w:line="276" w:lineRule="auto"/>
+            </w:pPr>
+            <w:r/>
+            <w:r>
+              <w:rPr>
+                <w:rFonts w:ascii="Calibri" w:hAnsi="Calibri" w:eastAsia="WenQuanYi Micro Hei"/>
+                <w:b w:val="0"/>
+                <w:i w:val="0"/>
+                <w:sz w:val="18"/>
+              </w:rPr>
+              <w:t>1952—1954</w:t>
+            </w:r>
+          </w:p>
+        </w:tc>
+        <w:tc>
+          <w:tcPr>
+            <w:tcW w:type="dxa" w:w="4759"/>
+            <w:shd w:val="clear" w:fill="FFFFFF"/>
+          </w:tcPr>
+          <w:p>
+            <w:pPr>
+              <w:spacing w:before="40" w:after="40" w:line="276" w:lineRule="auto"/>
+            </w:pPr>
+            <w:r/>
+            <w:r>
+              <w:rPr>
+                <w:rFonts w:ascii="Calibri" w:hAnsi="Calibri" w:eastAsia="WenQuanYi Micro Hei"/>
+                <w:b w:val="0"/>
+                <w:i w:val="0"/>
+                <w:sz w:val="18"/>
+              </w:rPr>
+              <w:t>旧金山美国租赁公司成立，现代独立第三方设备租赁起步</w:t>
+            </w:r>
+          </w:p>
+        </w:tc>
+      </w:tr>
+      <w:tr>
+        <w:tc>
+          <w:tcPr>
+            <w:tcW w:type="dxa" w:w="4759"/>
+            <w:shd w:val="clear" w:fill="F4F7FB"/>
+          </w:tcPr>
+          <w:p>
+            <w:pPr>
+              <w:spacing w:before="40" w:after="40" w:line="276" w:lineRule="auto"/>
+            </w:pPr>
+            <w:r/>
+            <w:r>
+              <w:rPr>
+                <w:rFonts w:ascii="Calibri" w:hAnsi="Calibri" w:eastAsia="WenQuanYi Micro Hei"/>
+                <w:b w:val="0"/>
+                <w:i w:val="0"/>
+                <w:sz w:val="18"/>
+              </w:rPr>
+              <w:t>1964</w:t>
+            </w:r>
+          </w:p>
+        </w:tc>
+        <w:tc>
+          <w:tcPr>
+            <w:tcW w:type="dxa" w:w="4759"/>
+            <w:shd w:val="clear" w:fill="F4F7FB"/>
+          </w:tcPr>
+          <w:p>
+            <w:pPr>
+              <w:spacing w:before="40" w:after="40" w:line="276" w:lineRule="auto"/>
+            </w:pPr>
+            <w:r/>
+            <w:r>
+              <w:rPr>
+                <w:rFonts w:ascii="Calibri" w:hAnsi="Calibri" w:eastAsia="WenQuanYi Micro Hei"/>
+                <w:b w:val="0"/>
+                <w:i w:val="0"/>
+                <w:sz w:val="18"/>
+              </w:rPr>
+              <w:t>大阪东方租赁（后ORIX）设立，美国模式进入日本</w:t>
+            </w:r>
+          </w:p>
+        </w:tc>
+      </w:tr>
+      <w:tr>
+        <w:tc>
+          <w:tcPr>
+            <w:tcW w:type="dxa" w:w="4759"/>
+            <w:shd w:val="clear" w:fill="FFFFFF"/>
+          </w:tcPr>
+          <w:p>
+            <w:pPr>
+              <w:spacing w:before="40" w:after="40" w:line="276" w:lineRule="auto"/>
+            </w:pPr>
+            <w:r/>
+            <w:r>
+              <w:rPr>
+                <w:rFonts w:ascii="Calibri" w:hAnsi="Calibri" w:eastAsia="WenQuanYi Micro Hei"/>
+                <w:b w:val="0"/>
+                <w:i w:val="0"/>
+                <w:sz w:val="18"/>
+              </w:rPr>
+              <w:t>1972年前后</w:t>
+            </w:r>
+          </w:p>
+        </w:tc>
+        <w:tc>
+          <w:tcPr>
+            <w:tcW w:type="dxa" w:w="4759"/>
+            <w:shd w:val="clear" w:fill="FFFFFF"/>
+          </w:tcPr>
+          <w:p>
+            <w:pPr>
+              <w:spacing w:before="40" w:after="40" w:line="276" w:lineRule="auto"/>
+            </w:pPr>
+            <w:r/>
+            <w:r>
+              <w:rPr>
+                <w:rFonts w:ascii="Calibri" w:hAnsi="Calibri" w:eastAsia="WenQuanYi Micro Hei"/>
+                <w:b w:val="0"/>
+                <w:i w:val="0"/>
+                <w:sz w:val="18"/>
+              </w:rPr>
+              <w:t>欧洲租赁协会（Leaseurope）成立</w:t>
+            </w:r>
+          </w:p>
+        </w:tc>
+      </w:tr>
+      <w:tr>
+        <w:tc>
+          <w:tcPr>
+            <w:tcW w:type="dxa" w:w="4759"/>
+            <w:shd w:val="clear" w:fill="F4F7FB"/>
+          </w:tcPr>
+          <w:p>
+            <w:pPr>
+              <w:spacing w:before="40" w:after="40" w:line="276" w:lineRule="auto"/>
+            </w:pPr>
+            <w:r/>
+            <w:r>
+              <w:rPr>
+                <w:rFonts w:ascii="Calibri" w:hAnsi="Calibri" w:eastAsia="WenQuanYi Micro Hei"/>
+                <w:b w:val="0"/>
+                <w:i w:val="0"/>
+                <w:sz w:val="18"/>
+              </w:rPr>
+              <w:t>1973 / 1975</w:t>
+            </w:r>
+          </w:p>
+        </w:tc>
+        <w:tc>
+          <w:tcPr>
+            <w:tcW w:type="dxa" w:w="4759"/>
+            <w:shd w:val="clear" w:fill="F4F7FB"/>
+          </w:tcPr>
+          <w:p>
+            <w:pPr>
+              <w:spacing w:before="40" w:after="40" w:line="276" w:lineRule="auto"/>
+            </w:pPr>
+            <w:r/>
+            <w:r>
+              <w:rPr>
+                <w:rFonts w:ascii="Calibri" w:hAnsi="Calibri" w:eastAsia="WenQuanYi Micro Hei"/>
+                <w:b w:val="0"/>
+                <w:i w:val="0"/>
+                <w:sz w:val="18"/>
+              </w:rPr>
+              <w:t>ILFC创立于洛杉矶；GPA创立于爱尔兰香农，飞机经营性租赁产业化</w:t>
+            </w:r>
+          </w:p>
+        </w:tc>
+      </w:tr>
+      <w:tr>
+        <w:tc>
+          <w:tcPr>
+            <w:tcW w:type="dxa" w:w="4759"/>
+            <w:shd w:val="clear" w:fill="FFFFFF"/>
+          </w:tcPr>
+          <w:p>
+            <w:pPr>
+              <w:spacing w:before="40" w:after="40" w:line="276" w:lineRule="auto"/>
+            </w:pPr>
+            <w:r/>
+            <w:r>
+              <w:rPr>
+                <w:rFonts w:ascii="Calibri" w:hAnsi="Calibri" w:eastAsia="WenQuanYi Micro Hei"/>
+                <w:b w:val="0"/>
+                <w:i w:val="0"/>
+                <w:sz w:val="18"/>
+              </w:rPr>
+              <w:t>1986</w:t>
+            </w:r>
+          </w:p>
+        </w:tc>
+        <w:tc>
+          <w:tcPr>
+            <w:tcW w:type="dxa" w:w="4759"/>
+            <w:shd w:val="clear" w:fill="FFFFFF"/>
+          </w:tcPr>
+          <w:p>
+            <w:pPr>
+              <w:spacing w:before="40" w:after="40" w:line="276" w:lineRule="auto"/>
+            </w:pPr>
+            <w:r/>
+            <w:r>
+              <w:rPr>
+                <w:rFonts w:ascii="Calibri" w:hAnsi="Calibri" w:eastAsia="WenQuanYi Micro Hei"/>
+                <w:b w:val="0"/>
+                <w:i w:val="0"/>
+                <w:sz w:val="18"/>
+              </w:rPr>
+              <w:t>美国税制改革冲击杠杆租赁等税务驱动结构</w:t>
+            </w:r>
+          </w:p>
+        </w:tc>
+      </w:tr>
+      <w:tr>
+        <w:tc>
+          <w:tcPr>
+            <w:tcW w:type="dxa" w:w="4759"/>
+            <w:shd w:val="clear" w:fill="F4F7FB"/>
+          </w:tcPr>
+          <w:p>
+            <w:pPr>
+              <w:spacing w:before="40" w:after="40" w:line="276" w:lineRule="auto"/>
+            </w:pPr>
+            <w:r/>
+            <w:r>
+              <w:rPr>
+                <w:rFonts w:ascii="Calibri" w:hAnsi="Calibri" w:eastAsia="WenQuanYi Micro Hei"/>
+                <w:b w:val="0"/>
+                <w:i w:val="0"/>
+                <w:sz w:val="18"/>
+              </w:rPr>
+              <w:t>1990 / 2014 / 2021</w:t>
+            </w:r>
+          </w:p>
+        </w:tc>
+        <w:tc>
+          <w:tcPr>
+            <w:tcW w:type="dxa" w:w="4759"/>
+            <w:shd w:val="clear" w:fill="F4F7FB"/>
+          </w:tcPr>
+          <w:p>
+            <w:pPr>
+              <w:spacing w:before="40" w:after="40" w:line="276" w:lineRule="auto"/>
+            </w:pPr>
+            <w:r/>
+            <w:r>
+              <w:rPr>
+                <w:rFonts w:ascii="Calibri" w:hAnsi="Calibri" w:eastAsia="WenQuanYi Micro Hei"/>
+                <w:b w:val="0"/>
+                <w:i w:val="0"/>
+                <w:sz w:val="18"/>
+              </w:rPr>
+              <w:t>AIG收购ILFC；AerCap收购ILFC；AerCap收购GECAS，全球航空租赁高度集中</w:t>
+            </w:r>
+          </w:p>
+        </w:tc>
+      </w:tr>
+      <w:tr>
+        <w:tc>
+          <w:tcPr>
+            <w:tcW w:type="dxa" w:w="4759"/>
+            <w:shd w:val="clear" w:fill="FFFFFF"/>
+          </w:tcPr>
+          <w:p>
+            <w:pPr>
+              <w:spacing w:before="40" w:after="40" w:line="276" w:lineRule="auto"/>
+            </w:pPr>
+            <w:r/>
+            <w:r>
+              <w:rPr>
+                <w:rFonts w:ascii="Calibri" w:hAnsi="Calibri" w:eastAsia="WenQuanYi Micro Hei"/>
+                <w:b w:val="0"/>
+                <w:i w:val="0"/>
+                <w:sz w:val="18"/>
+              </w:rPr>
+              <w:t>2016年起</w:t>
+            </w:r>
+          </w:p>
+        </w:tc>
+        <w:tc>
+          <w:tcPr>
+            <w:tcW w:type="dxa" w:w="4759"/>
+            <w:shd w:val="clear" w:fill="FFFFFF"/>
+          </w:tcPr>
+          <w:p>
+            <w:pPr>
+              <w:spacing w:before="40" w:after="40" w:line="276" w:lineRule="auto"/>
+            </w:pPr>
+            <w:r/>
+            <w:r>
+              <w:rPr>
+                <w:rFonts w:ascii="Calibri" w:hAnsi="Calibri" w:eastAsia="WenQuanYi Micro Hei"/>
+                <w:b w:val="0"/>
+                <w:i w:val="0"/>
+                <w:sz w:val="18"/>
+              </w:rPr>
+              <w:t>IFRS 16逐步实施，承租人表外优势减弱</w:t>
+            </w:r>
+          </w:p>
+        </w:tc>
+      </w:tr>
+      <w:tr>
+        <w:tc>
+          <w:tcPr>
+            <w:tcW w:type="dxa" w:w="4759"/>
+            <w:shd w:val="clear" w:fill="F4F7FB"/>
+          </w:tcPr>
+          <w:p>
+            <w:pPr>
+              <w:spacing w:before="40" w:after="40" w:line="276" w:lineRule="auto"/>
+            </w:pPr>
+            <w:r/>
+            <w:r>
+              <w:rPr>
+                <w:rFonts w:ascii="Calibri" w:hAnsi="Calibri" w:eastAsia="WenQuanYi Micro Hei"/>
+                <w:b w:val="0"/>
+                <w:i w:val="0"/>
+                <w:sz w:val="18"/>
+              </w:rPr>
+              <w:t>2010年代中期以来</w:t>
+            </w:r>
+          </w:p>
+        </w:tc>
+        <w:tc>
+          <w:tcPr>
+            <w:tcW w:type="dxa" w:w="4759"/>
+            <w:shd w:val="clear" w:fill="F4F7FB"/>
+          </w:tcPr>
+          <w:p>
+            <w:pPr>
+              <w:spacing w:before="40" w:after="40" w:line="276" w:lineRule="auto"/>
+            </w:pPr>
+            <w:r/>
+            <w:r>
+              <w:rPr>
+                <w:rFonts w:ascii="Calibri" w:hAnsi="Calibri" w:eastAsia="WenQuanYi Micro Hei"/>
+                <w:b w:val="0"/>
+                <w:i w:val="0"/>
+                <w:sz w:val="18"/>
+              </w:rPr>
+              <w:t>中国成为全球第二大租赁市场（国际统计口径，含商租与汽车等）</w:t>
+            </w:r>
+          </w:p>
+        </w:tc>
+      </w:tr>
+    </w:tbl>
+    <w:p/>
+    <w:p>
+      <w:pPr>
+        <w:pStyle w:val="Heading3"/>
+      </w:pPr>
+      <w:r>
+        <w:t>附录D 概念对照（避免混用）</w:t>
       </w:r>
     </w:p>
     <w:p>
@@ -10394,6 +12768,51 @@
           <w:sz w:val="22"/>
         </w:rPr>
         <w:t>《中华人民共和国民法典》合同编融资租赁合同；《企业会计准则第21号——租赁》。</w:t>
+      </w:r>
+    </w:p>
+    <w:p>
+      <w:pPr>
+        <w:pStyle w:val="ListNumber"/>
+        <w:spacing w:before="20" w:after="60" w:line="288" w:lineRule="auto"/>
+      </w:pPr>
+      <w:r>
+        <w:rPr>
+          <w:rFonts w:ascii="Calibri" w:hAnsi="Calibri" w:eastAsia="WenQuanYi Micro Hei"/>
+          <w:b w:val="0"/>
+          <w:i w:val="0"/>
+          <w:sz w:val="22"/>
+        </w:rPr>
+        <w:t>Equipment Leasing and Finance Association（ELFA）行业史与名人堂材料（美国租赁公司、Henry B. Schoenfeld）。</w:t>
+      </w:r>
+    </w:p>
+    <w:p>
+      <w:pPr>
+        <w:pStyle w:val="ListNumber"/>
+        <w:spacing w:before="20" w:after="60" w:line="288" w:lineRule="auto"/>
+      </w:pPr>
+      <w:r>
+        <w:rPr>
+          <w:rFonts w:ascii="Calibri" w:hAnsi="Calibri" w:eastAsia="WenQuanYi Micro Hei"/>
+          <w:b w:val="0"/>
+          <w:i w:val="0"/>
+          <w:sz w:val="22"/>
+        </w:rPr>
+        <w:t>ORIX、Mitsubishi HC Capital、AerCap公司官方沿革；Leaseurope；White Clarke / Solifi《Global Leasing Report》及《World Leasing Yearbook 2026》公开摘要（全球新增业务规模与国别位次）。</w:t>
+      </w:r>
+    </w:p>
+    <w:p>
+      <w:pPr>
+        <w:pStyle w:val="ListNumber"/>
+        <w:spacing w:before="20" w:after="60" w:line="288" w:lineRule="auto"/>
+      </w:pPr>
+      <w:r>
+        <w:rPr>
+          <w:rFonts w:ascii="Calibri" w:hAnsi="Calibri" w:eastAsia="WenQuanYi Micro Hei"/>
+          <w:b w:val="0"/>
+          <w:i w:val="0"/>
+          <w:sz w:val="22"/>
+        </w:rPr>
+        <w:t>SMBC Aviation Capital、BOC Aviation、Air Lease Corporation等机构2025—2026年公开机队口径（自有/托管/承诺不可直接加总）。</w:t>
       </w:r>
     </w:p>
     <w:p>

</xml_diff>